<commit_message>
feature/ se añade nuevo documento de requerimientos mas simple
</commit_message>
<xml_diff>
--- a/docs/MANUAL_REQUERIMIENTOS.docx
+++ b/docs/MANUAL_REQUERIMIENTOS.docx
@@ -486,7 +486,7 @@
               </wp:anchor>
             </w:drawing>
           </mc:Choice>
-          <mc:Fallback xmlns:a14="http://schemas.microsoft.com/office/drawing/2010/main" xmlns:pic="http://schemas.openxmlformats.org/drawingml/2006/picture" xmlns:a="http://schemas.openxmlformats.org/drawingml/2006/main">
+          <mc:Fallback xmlns:a="http://schemas.openxmlformats.org/drawingml/2006/main" xmlns:pic="http://schemas.openxmlformats.org/drawingml/2006/picture" xmlns:a14="http://schemas.microsoft.com/office/drawing/2010/main">
             <w:pict w14:anchorId="63622293">
               <v:shape id="Graphic 5" style="position:absolute;margin-left:-94.3pt;margin-top:-69.4pt;width:70.7pt;height:309.45pt;z-index:251660288;visibility:visible;mso-wrap-style:square;mso-width-percent:0;mso-wrap-distance-left:0;mso-wrap-distance-top:0;mso-wrap-distance-right:0;mso-wrap-distance-bottom:0;mso-position-horizontal:absolute;mso-position-horizontal-relative:margin;mso-position-vertical:absolute;mso-position-vertical-relative:text;mso-width-percent:0;mso-width-relative:margin;v-text-anchor:top" coordsize="875030,3930015" o:spid="_x0000_s1026" fillcolor="#4272c3" stroked="f" path="m615967,r14717,l634013,19156r6192,48307l647544,118912r7756,51370l663474,221570r8595,51202l681087,323882r9443,51015l700401,425813r10301,50813l721434,527332r11167,50594l744205,628404r12042,50359l768730,728998r12927,50106l805517,880114r11383,50502l827717,981161r10099,50626l847047,1082527r8212,50891l862300,1184495r5720,51297l872268,1287346r2001,51890l874542,1390990r-1210,51637l870888,1494166r-3432,51461l863283,1597029r-9582,102708l849836,1751416r-4298,51555l835655,1905747r-11577,102399l810829,2110250r-14895,101888l779416,2313892r-10123,48575l758420,2410864r-11621,48213l734435,2507096r-13102,47816l707498,2602518r-14564,47387l677647,2697064r-16008,46923l644917,2790666,448874,3305525r-19262,44496l408670,3393606r-22578,42698l361921,3478137r-25718,40995l308981,3559310r-18494,25398l367366,3442977r24139,-44987l413877,3352087r19945,-45426l434052,3306237,596762,2881563r35248,-94270l649123,2739467r16340,-48186l681042,2642770r14828,-48801l709957,2544912r13357,-49277l735951,2446173r11927,-49613l759106,2346832r17658,-100674l792787,2145104r7352,-50645l807026,2043749r6404,-50766l819332,1942172r5380,-50847l829554,1840452r4283,-50889l837543,1738668r3111,-50892l850578,1541676r2705,-48818l855401,1444066r1361,-48717l857196,1346760r-663,-48413l855042,1249302r-3564,-48602l846092,1152487r-6959,-47879l830851,1057007r-9356,-47377l811316,962421,800562,915326,731686,626497,709322,529125,698580,480381,688207,431576r-9946,-48884l668800,333714r-8920,-49091l651558,235404r-7666,-49366l629670,84508,621611,32664,615967,xem,3912387r32270,-37156l67845,3833128r35082,-42489l136129,3748209r96423,-129014l245245,3606697r39789,-34735l314062,3530011r27467,-43011l367366,3442977r-76879,141731l280300,3598697r-17339,17686l243869,3632659r-18739,16468l208852,3667389r-29630,41400l148699,3749304r-31264,39770l85584,3828238,,3929527r,-17140xe" o:gfxdata="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" w14:anchorId="18CFBED6">
                 <v:path arrowok="t"/>
@@ -573,7 +573,7 @@
                     <pic:cNvPicPr/>
                   </pic:nvPicPr>
                   <pic:blipFill>
-                    <a:blip r:embed="rId5">
+                    <a:blip r:embed="rId10">
                       <a:extLst>
                         <a:ext uri="{28A0092B-C50C-407E-A947-70E740481C1C}">
                           <a14:useLocalDpi xmlns:a14="http://schemas.microsoft.com/office/drawing/2010/main" val="0"/>
@@ -650,7 +650,21 @@
     </w:p>
     <w:p>
       <w:pPr>
-        <w:spacing w:line="240" w:lineRule="auto"/>
+        <w:spacing w:after="0" w:line="240" w:lineRule="auto"/>
+        <w:jc w:val="center"/>
+        <w:rPr>
+          <w:rFonts w:ascii="Arial" w:hAnsi="Arial" w:cs="Arial"/>
+          <w:b/>
+          <w:bCs/>
+          <w:color w:val="153D63" w:themeColor="text2" w:themeTint="E6"/>
+          <w:sz w:val="52"/>
+          <w:szCs w:val="52"/>
+        </w:rPr>
+      </w:pPr>
+    </w:p>
+    <w:p>
+      <w:pPr>
+        <w:spacing w:after="0" w:line="240" w:lineRule="auto"/>
         <w:jc w:val="center"/>
         <w:rPr>
           <w:rFonts w:ascii="Arial" w:hAnsi="Arial" w:cs="Arial"/>
@@ -1137,7 +1151,7 @@
               </wp:anchor>
             </w:drawing>
           </mc:Choice>
-          <mc:Fallback xmlns:a="http://schemas.openxmlformats.org/drawingml/2006/main" xmlns:a14="http://schemas.microsoft.com/office/drawing/2010/main" xmlns:pic="http://schemas.openxmlformats.org/drawingml/2006/picture"/>
+          <mc:Fallback xmlns:pic="http://schemas.openxmlformats.org/drawingml/2006/picture" xmlns:a14="http://schemas.microsoft.com/office/drawing/2010/main" xmlns:a="http://schemas.openxmlformats.org/drawingml/2006/main"/>
         </mc:AlternateContent>
       </w:r>
       <w:r>
@@ -1226,7 +1240,7 @@
               </wp:anchor>
             </w:drawing>
           </mc:Choice>
-          <mc:Fallback xmlns:a14="http://schemas.microsoft.com/office/drawing/2010/main" xmlns:pic="http://schemas.openxmlformats.org/drawingml/2006/picture" xmlns:a="http://schemas.openxmlformats.org/drawingml/2006/main">
+          <mc:Fallback xmlns:a="http://schemas.openxmlformats.org/drawingml/2006/main" xmlns:pic="http://schemas.openxmlformats.org/drawingml/2006/picture" xmlns:a14="http://schemas.microsoft.com/office/drawing/2010/main">
             <w:pict w14:anchorId="7D99C041">
               <v:shape id="Graphic 1" style="position:absolute;margin-left:560.05pt;margin-top:.75pt;width:611.25pt;height:842.25pt;z-index:-251655168;visibility:visible;mso-wrap-style:square;mso-width-percent:0;mso-height-percent:0;mso-wrap-distance-left:0;mso-wrap-distance-top:0;mso-wrap-distance-right:0;mso-wrap-distance-bottom:0;mso-position-horizontal:right;mso-position-horizontal-relative:page;mso-position-vertical:absolute;mso-position-vertical-relative:page;mso-width-percent:0;mso-height-percent:0;mso-width-relative:margin;mso-height-relative:margin;v-text-anchor:top" coordsize="7562850,10696575" o:spid="_x0000_s1026" fillcolor="#f5f1ec" stroked="f" path="m7562849,10696574l,10696574,,,7562849,r,10696574xe" o:gfxdata="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" w14:anchorId="001D286A">
                 <v:path arrowok="t"/>
@@ -1245,7 +1259,118 @@
           <w:sz w:val="52"/>
           <w:szCs w:val="52"/>
         </w:rPr>
-        <w:t xml:space="preserve">DOCUMENTO DE REQUERIMIENTOS </w:t>
+        <w:t>FORMATO</w:t>
+      </w:r>
+    </w:p>
+    <w:p>
+      <w:pPr>
+        <w:spacing w:after="0" w:line="240" w:lineRule="auto"/>
+        <w:jc w:val="center"/>
+        <w:rPr>
+          <w:rFonts w:ascii="Arial" w:hAnsi="Arial" w:cs="Arial"/>
+          <w:b/>
+          <w:bCs/>
+          <w:color w:val="153D63" w:themeColor="text2" w:themeTint="E6"/>
+          <w:sz w:val="52"/>
+          <w:szCs w:val="52"/>
+        </w:rPr>
+      </w:pPr>
+      <w:r>
+        <w:rPr>
+          <w:rFonts w:ascii="Arial" w:hAnsi="Arial" w:cs="Arial"/>
+          <w:b/>
+          <w:bCs/>
+          <w:color w:val="153D63" w:themeColor="text2" w:themeTint="E6"/>
+          <w:sz w:val="52"/>
+          <w:szCs w:val="52"/>
+        </w:rPr>
+        <w:t>REQUERIMIENTOS</w:t>
+      </w:r>
+    </w:p>
+    <w:p>
+      <w:pPr>
+        <w:spacing w:after="0" w:line="240" w:lineRule="auto"/>
+        <w:jc w:val="center"/>
+        <w:rPr>
+          <w:rFonts w:ascii="Arial" w:hAnsi="Arial" w:cs="Arial"/>
+          <w:b/>
+          <w:bCs/>
+          <w:color w:val="153D63" w:themeColor="text2" w:themeTint="E6"/>
+          <w:sz w:val="52"/>
+          <w:szCs w:val="52"/>
+        </w:rPr>
+      </w:pPr>
+      <w:r>
+        <w:rPr>
+          <w:rFonts w:ascii="Arial" w:hAnsi="Arial" w:cs="Arial"/>
+          <w:b/>
+          <w:bCs/>
+          <w:color w:val="153D63" w:themeColor="text2" w:themeTint="E6"/>
+          <w:sz w:val="52"/>
+          <w:szCs w:val="52"/>
+        </w:rPr>
+        <w:t>DESARROLLOS DE</w:t>
+      </w:r>
+    </w:p>
+    <w:p>
+      <w:pPr>
+        <w:spacing w:after="0" w:line="240" w:lineRule="auto"/>
+        <w:jc w:val="center"/>
+        <w:rPr>
+          <w:rFonts w:ascii="Arial" w:hAnsi="Arial" w:cs="Arial"/>
+          <w:b/>
+          <w:bCs/>
+          <w:color w:val="153D63" w:themeColor="text2" w:themeTint="E6"/>
+          <w:sz w:val="52"/>
+          <w:szCs w:val="52"/>
+        </w:rPr>
+      </w:pPr>
+      <w:r>
+        <w:rPr>
+          <w:rFonts w:ascii="Arial" w:hAnsi="Arial" w:cs="Arial"/>
+          <w:b/>
+          <w:bCs/>
+          <w:color w:val="153D63" w:themeColor="text2" w:themeTint="E6"/>
+          <w:sz w:val="52"/>
+          <w:szCs w:val="52"/>
+        </w:rPr>
+        <w:t>SOFTWARE</w:t>
+      </w:r>
+    </w:p>
+    <w:p>
+      <w:pPr>
+        <w:spacing w:line="240" w:lineRule="auto"/>
+        <w:jc w:val="center"/>
+        <w:rPr>
+          <w:rFonts w:ascii="Arial" w:hAnsi="Arial" w:cs="Arial"/>
+          <w:b/>
+          <w:bCs/>
+          <w:color w:val="153D63" w:themeColor="text2" w:themeTint="E6"/>
+          <w:sz w:val="52"/>
+          <w:szCs w:val="52"/>
+        </w:rPr>
+      </w:pPr>
+      <w:r>
+        <w:rPr>
+          <w:rFonts w:ascii="Arial" w:hAnsi="Arial" w:cs="Arial"/>
+          <w:b/>
+          <w:bCs/>
+          <w:color w:val="153D63" w:themeColor="text2" w:themeTint="E6"/>
+          <w:sz w:val="52"/>
+          <w:szCs w:val="52"/>
+        </w:rPr>
+        <w:t>INHOUSE</w:t>
+      </w:r>
+      <w:r>
+        <w:rPr>
+          <w:rFonts w:ascii="Arial" w:hAnsi="Arial" w:cs="Arial"/>
+          <w:b/>
+          <w:bCs/>
+          <w:color w:val="153D63" w:themeColor="text2" w:themeTint="E6"/>
+          <w:sz w:val="52"/>
+          <w:szCs w:val="52"/>
+        </w:rPr>
+        <w:t xml:space="preserve"> </w:t>
       </w:r>
     </w:p>
     <w:p>
@@ -2275,7 +2400,7 @@
               </wp:anchor>
             </w:drawing>
           </mc:Choice>
-          <mc:Fallback xmlns:a14="http://schemas.microsoft.com/office/drawing/2010/main" xmlns:pic="http://schemas.openxmlformats.org/drawingml/2006/picture" xmlns:a="http://schemas.openxmlformats.org/drawingml/2006/main">
+          <mc:Fallback xmlns:a="http://schemas.openxmlformats.org/drawingml/2006/main" xmlns:pic="http://schemas.openxmlformats.org/drawingml/2006/picture" xmlns:a14="http://schemas.microsoft.com/office/drawing/2010/main">
             <w:pict w14:anchorId="49DD5149">
               <v:group id="Group 6" style="position:absolute;margin-left:0;margin-top:0;width:264.85pt;height:314.1pt;z-index:-251654144;mso-wrap-distance-left:0;mso-wrap-distance-right:0;mso-position-horizontal:left;mso-position-horizontal-relative:page;mso-position-vertical:bottom;mso-position-vertical-relative:page;mso-width-relative:margin" coordsize="32772,39890" o:spid="_x0000_s1026" w14:anchorId="2AA63416" o:gfxdata="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">
                 <v:shape id="Graphic 7" style="position:absolute;top:18411;width:18453;height:21475;visibility:visible;mso-wrap-style:square;v-text-anchor:top" coordsize="1845310,2147570" o:spid="_x0000_s1027" fillcolor="#f2e3d5" stroked="f" path="m1844915,2147541l,2147541,,125735r16037,-6290l63480,102180,111831,85902,161091,70612,211260,56309,262337,42993,314322,30665r45777,-9540l405034,13357,449129,7360,492383,3135,534796,681,576369,r40731,1089l656991,3950r39050,4633l734250,14987r37369,8176l843833,44830r68852,28753l978173,109422r62125,42926l1070099,176468r28961,25892l1127179,230023r27279,29435l1180896,290664r25598,32978l1231250,358392r23916,36521l1278241,433206r22234,40064l1321868,515106r20553,43608l1362133,604093r18871,47151l1399034,700166r17189,50694l1432572,803325r15508,54238l1462747,913571r13826,57780l1489558,1030903r12145,61324l1525685,1226956r13328,69649l1552989,1364269r14625,65679l1582888,1493641r15922,61709l1615381,1615073r17220,57738l1650470,1728564r18518,53768l1688154,1834115r19815,49797l1728433,1931725r21113,45827l1771307,2021394r22411,41857l1816777,2103123r23708,37887l1844915,2147541xe" o:gfxdata="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">
@@ -2355,53 +2480,6 @@
     </w:p>
     <w:p>
       <w:pPr>
-        <w:spacing w:line="240" w:lineRule="auto"/>
-        <w:rPr>
-          <w:rFonts w:ascii="Arial" w:hAnsi="Arial" w:cs="Arial"/>
-        </w:rPr>
-      </w:pPr>
-    </w:p>
-    <w:p>
-      <w:pPr>
-        <w:spacing w:line="240" w:lineRule="auto"/>
-        <w:rPr>
-          <w:rFonts w:ascii="Arial" w:hAnsi="Arial" w:cs="Arial"/>
-        </w:rPr>
-      </w:pPr>
-    </w:p>
-    <w:p>
-      <w:pPr>
-        <w:spacing w:line="240" w:lineRule="auto"/>
-        <w:rPr>
-          <w:rFonts w:ascii="Arial" w:hAnsi="Arial" w:cs="Arial"/>
-        </w:rPr>
-      </w:pPr>
-    </w:p>
-    <w:p>
-      <w:pPr>
-        <w:spacing w:line="240" w:lineRule="auto"/>
-        <w:rPr>
-          <w:rFonts w:ascii="Arial" w:hAnsi="Arial" w:cs="Arial"/>
-        </w:rPr>
-      </w:pPr>
-    </w:p>
-    <w:p>
-      <w:pPr>
-        <w:spacing w:line="240" w:lineRule="auto"/>
-        <w:rPr>
-          <w:rFonts w:ascii="Arial" w:hAnsi="Arial" w:cs="Arial"/>
-        </w:rPr>
-      </w:pPr>
-    </w:p>
-    <w:p>
-      <w:pPr>
-        <w:rPr>
-          <w:rFonts w:ascii="Arial" w:hAnsi="Arial" w:cs="Arial"/>
-        </w:rPr>
-      </w:pPr>
-    </w:p>
-    <w:p>
-      <w:pPr>
         <w:rPr>
           <w:rFonts w:ascii="Arial" w:hAnsi="Arial" w:cs="Arial"/>
           <w:b/>
@@ -2415,11 +2493,20 @@
           <w:bCs/>
         </w:rPr>
         <w:lastRenderedPageBreak/>
-        <w:t>Instrucciones de Uso</w:t>
+        <w:t xml:space="preserve">Instrucciones </w:t>
+      </w:r>
+      <w:r>
+        <w:rPr>
+          <w:rFonts w:ascii="Arial" w:hAnsi="Arial" w:cs="Arial"/>
+          <w:b/>
+          <w:bCs/>
+        </w:rPr>
+        <w:t>para el diligenciamiento</w:t>
       </w:r>
     </w:p>
     <w:p>
       <w:pPr>
+        <w:jc w:val="both"/>
         <w:rPr>
           <w:rFonts w:ascii="Arial" w:hAnsi="Arial" w:cs="Arial"/>
           <w:b/>
@@ -2430,46 +2517,209 @@
         <w:rPr>
           <w:rFonts w:ascii="Arial" w:hAnsi="Arial" w:cs="Arial"/>
         </w:rPr>
-        <w:t>Este documento le ayudará a definir claramente los requerimientos de su proyecto de software.</w:t>
+        <w:t xml:space="preserve">Este </w:t>
       </w:r>
       <w:r>
         <w:rPr>
           <w:rFonts w:ascii="Arial" w:hAnsi="Arial" w:cs="Arial"/>
         </w:rPr>
-        <w:br/>
-        <w:t xml:space="preserve">Complete cada sección con el mayor detalle posible. </w:t>
+        <w:t>formato</w:t>
       </w:r>
       <w:r>
         <w:rPr>
           <w:rFonts w:ascii="Arial" w:hAnsi="Arial" w:cs="Arial"/>
+        </w:rPr>
+        <w:t xml:space="preserve"> le ayudará a </w:t>
+      </w:r>
+      <w:r>
+        <w:rPr>
+          <w:rFonts w:ascii="Arial" w:hAnsi="Arial" w:cs="Arial"/>
+        </w:rPr>
+        <w:t>redactar</w:t>
+      </w:r>
+      <w:r>
+        <w:rPr>
+          <w:rFonts w:ascii="Arial" w:hAnsi="Arial" w:cs="Arial"/>
+        </w:rPr>
+        <w:t xml:space="preserve"> los requerimientos de su proyecto de software.</w:t>
+      </w:r>
+      <w:r>
+        <w:rPr>
+          <w:rFonts w:ascii="Arial" w:hAnsi="Arial" w:cs="Arial"/>
+        </w:rPr>
+        <w:t xml:space="preserve"> </w:t>
+      </w:r>
+      <w:r>
+        <w:rPr>
+          <w:rFonts w:ascii="Arial" w:hAnsi="Arial" w:cs="Arial"/>
+        </w:rPr>
+        <w:t>Complete</w:t>
+      </w:r>
+      <w:r>
+        <w:rPr>
+          <w:rFonts w:ascii="Arial" w:hAnsi="Arial" w:cs="Arial"/>
+        </w:rPr>
+        <w:t xml:space="preserve"> </w:t>
+      </w:r>
+      <w:r>
+        <w:rPr>
+          <w:rFonts w:ascii="Arial" w:hAnsi="Arial" w:cs="Arial"/>
+        </w:rPr>
+        <w:t xml:space="preserve">el punto </w:t>
+      </w:r>
+      <w:r>
+        <w:rPr>
+          <w:rFonts w:ascii="Arial" w:hAnsi="Arial" w:cs="Arial"/>
           <w:b/>
           <w:bCs/>
-        </w:rPr>
-        <w:t>Entre más específica sea la información, mejor podremos desarrollar una solución que cumpla exactamente con sus expectativas.</w:t>
+          <w:i/>
+          <w:iCs/>
+        </w:rPr>
+        <w:t>2</w:t>
+      </w:r>
+      <w:r>
+        <w:rPr>
+          <w:rFonts w:ascii="Arial" w:hAnsi="Arial" w:cs="Arial"/>
+          <w:i/>
+          <w:iCs/>
+        </w:rPr>
+        <w:t>.</w:t>
+      </w:r>
+      <w:r>
+        <w:rPr>
+          <w:rFonts w:ascii="Arial" w:hAnsi="Arial" w:cs="Arial"/>
+        </w:rPr>
+        <w:t xml:space="preserve"> </w:t>
+      </w:r>
+      <w:r>
+        <w:rPr>
+          <w:rFonts w:ascii="Arial" w:hAnsi="Arial" w:cs="Arial"/>
+          <w:b/>
+          <w:bCs/>
+          <w:i/>
+          <w:iCs/>
+        </w:rPr>
+        <w:t>F</w:t>
+      </w:r>
+      <w:r>
+        <w:rPr>
+          <w:rFonts w:ascii="Arial" w:hAnsi="Arial" w:cs="Arial"/>
+          <w:b/>
+          <w:bCs/>
+          <w:i/>
+          <w:iCs/>
+        </w:rPr>
+        <w:t xml:space="preserve">uncionalidades del </w:t>
+      </w:r>
+      <w:r>
+        <w:rPr>
+          <w:rFonts w:ascii="Arial" w:hAnsi="Arial" w:cs="Arial"/>
+          <w:b/>
+          <w:bCs/>
+          <w:i/>
+          <w:iCs/>
+        </w:rPr>
+        <w:t>S</w:t>
+      </w:r>
+      <w:r>
+        <w:rPr>
+          <w:rFonts w:ascii="Arial" w:hAnsi="Arial" w:cs="Arial"/>
+          <w:b/>
+          <w:bCs/>
+          <w:i/>
+          <w:iCs/>
+        </w:rPr>
+        <w:t>istema</w:t>
+      </w:r>
+      <w:r>
+        <w:rPr>
+          <w:rFonts w:ascii="Arial" w:hAnsi="Arial" w:cs="Arial"/>
+        </w:rPr>
+        <w:t xml:space="preserve"> con el mayor detalle posible</w:t>
+      </w:r>
+      <w:r>
+        <w:rPr>
+          <w:rFonts w:ascii="Arial" w:hAnsi="Arial" w:cs="Arial"/>
+        </w:rPr>
+        <w:t>, es allí donde debe consig</w:t>
+      </w:r>
+      <w:r>
+        <w:rPr>
+          <w:rFonts w:ascii="Arial" w:hAnsi="Arial" w:cs="Arial"/>
+        </w:rPr>
+        <w:t>narse</w:t>
+      </w:r>
+      <w:r>
+        <w:rPr>
+          <w:rFonts w:ascii="Arial" w:hAnsi="Arial" w:cs="Arial"/>
+        </w:rPr>
+        <w:t xml:space="preserve"> lo que espera del desarrollo</w:t>
+      </w:r>
+      <w:r>
+        <w:rPr>
+          <w:rFonts w:ascii="Arial" w:hAnsi="Arial" w:cs="Arial"/>
+        </w:rPr>
+        <w:t xml:space="preserve"> de software</w:t>
+      </w:r>
+      <w:r>
+        <w:rPr>
+          <w:rFonts w:ascii="Arial" w:hAnsi="Arial" w:cs="Arial"/>
+        </w:rPr>
+        <w:t xml:space="preserve">. </w:t>
+      </w:r>
+      <w:r>
+        <w:rPr>
+          <w:rFonts w:ascii="Arial" w:hAnsi="Arial" w:cs="Arial"/>
+          <w:b/>
+          <w:bCs/>
+        </w:rPr>
+        <w:t>Entre más específica sea la información, mejor podremos desarrollar una solución cumpl</w:t>
+      </w:r>
+      <w:r>
+        <w:rPr>
+          <w:rFonts w:ascii="Arial" w:hAnsi="Arial" w:cs="Arial"/>
+          <w:b/>
+          <w:bCs/>
+        </w:rPr>
+        <w:t>iendo</w:t>
+      </w:r>
+      <w:r>
+        <w:rPr>
+          <w:rFonts w:ascii="Arial" w:hAnsi="Arial" w:cs="Arial"/>
+          <w:b/>
+          <w:bCs/>
+        </w:rPr>
+        <w:t xml:space="preserve"> </w:t>
+      </w:r>
+      <w:r>
+        <w:rPr>
+          <w:rFonts w:ascii="Arial" w:hAnsi="Arial" w:cs="Arial"/>
+          <w:b/>
+          <w:bCs/>
+        </w:rPr>
+        <w:t>alineada con las</w:t>
+      </w:r>
+      <w:r>
+        <w:rPr>
+          <w:rFonts w:ascii="Arial" w:hAnsi="Arial" w:cs="Arial"/>
+          <w:b/>
+          <w:bCs/>
+        </w:rPr>
+        <w:t xml:space="preserve"> expectativas.</w:t>
       </w:r>
     </w:p>
     <w:p>
       <w:pPr>
+        <w:jc w:val="both"/>
+        <w:rPr>
+          <w:rFonts w:ascii="Arial" w:hAnsi="Arial" w:cs="Arial"/>
+        </w:rPr>
+      </w:pPr>
+      <w:r>
         <w:rPr>
           <w:rFonts w:ascii="Arial" w:hAnsi="Arial" w:cs="Arial"/>
           <w:b/>
           <w:bCs/>
-        </w:rPr>
-      </w:pPr>
-    </w:p>
-    <w:p>
-      <w:pPr>
-        <w:rPr>
-          <w:rFonts w:ascii="Arial" w:hAnsi="Arial" w:cs="Arial"/>
-        </w:rPr>
-      </w:pPr>
-      <w:r>
-        <w:rPr>
-          <w:rFonts w:ascii="Arial" w:hAnsi="Arial" w:cs="Arial"/>
-          <w:b/>
-          <w:bCs/>
-          <w:sz w:val="22"/>
-          <w:szCs w:val="22"/>
         </w:rPr>
         <w:t>¡Importante!</w:t>
       </w:r>
@@ -2478,38 +2728,75 @@
           <w:rFonts w:ascii="Arial" w:hAnsi="Arial" w:cs="Arial"/>
           <w:b/>
           <w:bCs/>
-          <w:sz w:val="22"/>
-          <w:szCs w:val="22"/>
         </w:rPr>
         <w:t xml:space="preserve">: </w:t>
       </w:r>
       <w:r>
         <w:rPr>
           <w:rFonts w:ascii="Arial" w:hAnsi="Arial" w:cs="Arial"/>
-          <w:sz w:val="22"/>
-          <w:szCs w:val="22"/>
-        </w:rPr>
-        <w:t>Si desea agregar mas información que considere relevante para entender el proceso, agrega</w:t>
+        </w:rPr>
+        <w:t xml:space="preserve">Si desea agregar </w:t>
       </w:r>
       <w:r>
         <w:rPr>
           <w:rFonts w:ascii="Arial" w:hAnsi="Arial" w:cs="Arial"/>
-          <w:sz w:val="22"/>
-          <w:szCs w:val="22"/>
+        </w:rPr>
+        <w:t>más</w:t>
+      </w:r>
+      <w:r>
+        <w:rPr>
+          <w:rFonts w:ascii="Arial" w:hAnsi="Arial" w:cs="Arial"/>
+        </w:rPr>
+        <w:t xml:space="preserve"> información que considere relevante para entender </w:t>
+      </w:r>
+      <w:r>
+        <w:rPr>
+          <w:rFonts w:ascii="Arial" w:hAnsi="Arial" w:cs="Arial"/>
+        </w:rPr>
+        <w:t>las necesidades</w:t>
+      </w:r>
+      <w:r>
+        <w:rPr>
+          <w:rFonts w:ascii="Arial" w:hAnsi="Arial" w:cs="Arial"/>
+        </w:rPr>
+        <w:t>, agrega</w:t>
+      </w:r>
+      <w:r>
+        <w:rPr>
+          <w:rFonts w:ascii="Arial" w:hAnsi="Arial" w:cs="Arial"/>
         </w:rPr>
         <w:t>r</w:t>
       </w:r>
       <w:r>
         <w:rPr>
           <w:rFonts w:ascii="Arial" w:hAnsi="Arial" w:cs="Arial"/>
-          <w:sz w:val="22"/>
-          <w:szCs w:val="22"/>
         </w:rPr>
         <w:t>lo al final</w:t>
+      </w:r>
+      <w:r>
+        <w:rPr>
+          <w:rFonts w:ascii="Arial" w:hAnsi="Arial" w:cs="Arial"/>
+        </w:rPr>
+        <w:t xml:space="preserve">, diagramas de flujo que amplíen un proceso, imágenes o </w:t>
+      </w:r>
+      <w:proofErr w:type="spellStart"/>
+      <w:r>
+        <w:rPr>
+          <w:rFonts w:ascii="Arial" w:hAnsi="Arial" w:cs="Arial"/>
+        </w:rPr>
+        <w:t>KPIs</w:t>
+      </w:r>
+      <w:proofErr w:type="spellEnd"/>
+      <w:r>
+        <w:rPr>
+          <w:rFonts w:ascii="Arial" w:hAnsi="Arial" w:cs="Arial"/>
+        </w:rPr>
+        <w:t xml:space="preserve"> si se requieren indicadores, entre otros.</w:t>
       </w:r>
     </w:p>
     <w:p>
       <w:pPr>
+        <w:jc w:val="both"/>
         <w:rPr>
           <w:rFonts w:ascii="Arial" w:hAnsi="Arial" w:cs="Arial"/>
         </w:rPr>
@@ -2525,7 +2812,17 @@
     </w:p>
     <w:p>
       <w:pPr>
-        <w:jc w:val="center"/>
+        <w:jc w:val="both"/>
+        <w:rPr>
+          <w:rFonts w:ascii="Arial" w:hAnsi="Arial" w:cs="Arial"/>
+          <w:b/>
+          <w:bCs/>
+        </w:rPr>
+      </w:pPr>
+    </w:p>
+    <w:p>
+      <w:pPr>
+        <w:jc w:val="both"/>
         <w:rPr>
           <w:rFonts w:ascii="Arial" w:hAnsi="Arial" w:cs="Arial"/>
           <w:b/>
@@ -2543,23 +2840,12 @@
     </w:p>
     <w:p>
       <w:pPr>
-        <w:rPr>
-          <w:rFonts w:ascii="Arial" w:hAnsi="Arial" w:cs="Arial"/>
-          <w:b/>
-          <w:bCs/>
-        </w:rPr>
-      </w:pPr>
-      <w:r>
-        <w:rPr>
-          <w:rFonts w:ascii="Arial" w:hAnsi="Arial" w:cs="Arial"/>
-          <w:b/>
-          <w:bCs/>
-        </w:rPr>
-        <w:t>Descripción General del Proyecto</w:t>
-      </w:r>
-    </w:p>
-    <w:p>
-      <w:pPr>
+        <w:pStyle w:val="Prrafodelista"/>
+        <w:numPr>
+          <w:ilvl w:val="0"/>
+          <w:numId w:val="59"/>
+        </w:numPr>
+        <w:jc w:val="both"/>
         <w:rPr>
           <w:rFonts w:ascii="Arial" w:hAnsi="Arial" w:cs="Arial"/>
         </w:rPr>
@@ -2605,6 +2891,7 @@
     </w:p>
     <w:p>
       <w:pPr>
+        <w:jc w:val="both"/>
         <w:rPr>
           <w:rFonts w:ascii="Arial" w:hAnsi="Arial" w:cs="Arial"/>
         </w:rPr>
@@ -2615,7 +2902,7 @@
           <w:b/>
           <w:bCs/>
         </w:rPr>
-        <w:t>Preguntas guía:</w:t>
+        <w:t>Para construir y redactar el propósito piense en las siguientes preguntas:</w:t>
       </w:r>
     </w:p>
     <w:p>
@@ -2624,6 +2911,8 @@
           <w:ilvl w:val="0"/>
           <w:numId w:val="56"/>
         </w:numPr>
+        <w:spacing w:after="0"/>
+        <w:jc w:val="both"/>
         <w:rPr>
           <w:rFonts w:ascii="Arial" w:hAnsi="Arial" w:cs="Arial"/>
         </w:rPr>
@@ -2634,49 +2923,69 @@
         </w:rPr>
         <w:t>¿Cuál es el problema o necesidad que quiere resolver?</w:t>
       </w:r>
+    </w:p>
+    <w:p>
+      <w:pPr>
+        <w:spacing w:after="0"/>
+        <w:ind w:left="720"/>
+        <w:jc w:val="both"/>
+        <w:rPr>
+          <w:rFonts w:ascii="Arial" w:hAnsi="Arial" w:cs="Arial"/>
+        </w:rPr>
+      </w:pPr>
       <w:r>
         <w:rPr>
           <w:rFonts w:ascii="Arial" w:hAnsi="Arial" w:cs="Arial"/>
-        </w:rPr>
-        <w:br/>
+          <w:i/>
+          <w:iCs/>
+        </w:rPr>
+        <w:t>Ejemplos:</w:t>
+      </w:r>
+    </w:p>
+    <w:p>
+      <w:pPr>
+        <w:spacing w:after="0"/>
+        <w:ind w:firstLine="708"/>
+        <w:jc w:val="both"/>
+        <w:rPr>
+          <w:rFonts w:ascii="Arial" w:hAnsi="Arial" w:cs="Arial"/>
+        </w:rPr>
+      </w:pPr>
+      <w:r>
+        <w:rPr>
+          <w:rFonts w:ascii="Arial" w:hAnsi="Arial" w:cs="Arial"/>
+          <w:i/>
+          <w:iCs/>
+        </w:rPr>
+        <w:t xml:space="preserve">- </w:t>
       </w:r>
       <w:r>
         <w:rPr>
           <w:rFonts w:ascii="Arial" w:hAnsi="Arial" w:cs="Arial"/>
-          <w:i/>
-          <w:iCs/>
-        </w:rPr>
-        <w:t xml:space="preserve">- Llevar el control alrededor de los </w:t>
+        </w:rPr>
+        <w:t xml:space="preserve">Llevar el control de los </w:t>
       </w:r>
       <w:r>
         <w:rPr>
           <w:rFonts w:ascii="Arial" w:hAnsi="Arial" w:cs="Arial"/>
-          <w:i/>
-          <w:iCs/>
         </w:rPr>
         <w:t>préstamos</w:t>
       </w:r>
       <w:r>
         <w:rPr>
           <w:rFonts w:ascii="Arial" w:hAnsi="Arial" w:cs="Arial"/>
-          <w:i/>
-          <w:iCs/>
         </w:rPr>
         <w:t xml:space="preserve"> de </w:t>
       </w:r>
       <w:r>
         <w:rPr>
           <w:rFonts w:ascii="Arial" w:hAnsi="Arial" w:cs="Arial"/>
-          <w:i/>
-          <w:iCs/>
         </w:rPr>
         <w:t>RF (Radiofrecuencias)</w:t>
       </w:r>
       <w:r>
         <w:rPr>
           <w:rFonts w:ascii="Arial" w:hAnsi="Arial" w:cs="Arial"/>
-          <w:i/>
-          <w:iCs/>
         </w:rPr>
         <w:t>.</w:t>
       </w:r>
@@ -2684,6 +2993,7 @@
     <w:p>
       <w:pPr>
         <w:ind w:left="720"/>
+        <w:jc w:val="both"/>
         <w:rPr>
           <w:rFonts w:ascii="Arial" w:hAnsi="Arial" w:cs="Arial"/>
         </w:rPr>
@@ -2692,13 +3002,7 @@
         <w:rPr>
           <w:rFonts w:ascii="Arial" w:hAnsi="Arial" w:cs="Arial"/>
         </w:rPr>
-        <w:t>-</w:t>
-      </w:r>
-      <w:r>
-        <w:rPr>
-          <w:rFonts w:ascii="Arial" w:hAnsi="Arial" w:cs="Arial"/>
-        </w:rPr>
-        <w:t xml:space="preserve"> </w:t>
+        <w:t xml:space="preserve">- </w:t>
       </w:r>
       <w:r>
         <w:rPr>
@@ -2719,6 +3023,8 @@
           <w:ilvl w:val="0"/>
           <w:numId w:val="56"/>
         </w:numPr>
+        <w:spacing w:after="0"/>
+        <w:jc w:val="both"/>
         <w:rPr>
           <w:rFonts w:ascii="Arial" w:hAnsi="Arial" w:cs="Arial"/>
         </w:rPr>
@@ -2727,23 +3033,62 @@
         <w:rPr>
           <w:rFonts w:ascii="Arial" w:hAnsi="Arial" w:cs="Arial"/>
         </w:rPr>
-        <w:t>¿Quiénes son los usuarios principales de este sistema?</w:t>
+        <w:t>¿Quiénes son los usuarios principales de este sistema</w:t>
+      </w:r>
+      <w:r>
+        <w:rPr>
+          <w:rFonts w:ascii="Arial" w:hAnsi="Arial" w:cs="Arial"/>
+        </w:rPr>
+        <w:t xml:space="preserve"> a quien está dirigido</w:t>
+      </w:r>
+      <w:r>
+        <w:rPr>
+          <w:rFonts w:ascii="Arial" w:hAnsi="Arial" w:cs="Arial"/>
+        </w:rPr>
+        <w:t>?</w:t>
       </w:r>
     </w:p>
     <w:p>
       <w:pPr>
+        <w:spacing w:after="0"/>
         <w:ind w:left="720"/>
-        <w:rPr>
-          <w:rFonts w:ascii="Arial" w:hAnsi="Arial" w:cs="Arial"/>
-        </w:rPr>
-      </w:pPr>
-      <w:r>
+        <w:jc w:val="both"/>
         <w:rPr>
           <w:rFonts w:ascii="Arial" w:hAnsi="Arial" w:cs="Arial"/>
           <w:i/>
           <w:iCs/>
         </w:rPr>
-        <w:t>Empleados del área de suministros.</w:t>
+      </w:pPr>
+      <w:r>
+        <w:rPr>
+          <w:rFonts w:ascii="Arial" w:hAnsi="Arial" w:cs="Arial"/>
+          <w:i/>
+          <w:iCs/>
+        </w:rPr>
+        <w:t>Ejemplo:</w:t>
+      </w:r>
+    </w:p>
+    <w:p>
+      <w:pPr>
+        <w:ind w:left="720"/>
+        <w:jc w:val="both"/>
+        <w:rPr>
+          <w:rFonts w:ascii="Arial" w:hAnsi="Arial" w:cs="Arial"/>
+        </w:rPr>
+      </w:pPr>
+      <w:r>
+        <w:rPr>
+          <w:rFonts w:ascii="Arial" w:hAnsi="Arial" w:cs="Arial"/>
+        </w:rPr>
+        <w:t>Empleados del área de suministros</w:t>
+      </w:r>
+      <w:r>
+        <w:rPr>
+          <w:rFonts w:ascii="Arial" w:hAnsi="Arial" w:cs="Arial"/>
+          <w:i/>
+          <w:iCs/>
+        </w:rPr>
+        <w:t>.</w:t>
       </w:r>
     </w:p>
     <w:p>
@@ -2752,6 +3097,8 @@
           <w:ilvl w:val="0"/>
           <w:numId w:val="56"/>
         </w:numPr>
+        <w:spacing w:after="0"/>
+        <w:jc w:val="both"/>
         <w:rPr>
           <w:rFonts w:ascii="Arial" w:hAnsi="Arial" w:cs="Arial"/>
         </w:rPr>
@@ -2765,26 +3112,44 @@
     </w:p>
     <w:p>
       <w:pPr>
+        <w:spacing w:after="0"/>
         <w:ind w:left="720"/>
-        <w:rPr>
-          <w:rFonts w:ascii="Arial" w:hAnsi="Arial" w:cs="Arial"/>
+        <w:jc w:val="both"/>
+        <w:rPr>
+          <w:rFonts w:ascii="Arial" w:hAnsi="Arial" w:cs="Arial"/>
+          <w:i/>
+          <w:iCs/>
         </w:rPr>
       </w:pPr>
       <w:r>
         <w:rPr>
           <w:rFonts w:ascii="Arial" w:hAnsi="Arial" w:cs="Arial"/>
-        </w:rPr>
-        <w:t xml:space="preserve">Se espera lograr </w:t>
+          <w:i/>
+          <w:iCs/>
+        </w:rPr>
+        <w:t>Ejemplo</w:t>
       </w:r>
       <w:r>
         <w:rPr>
           <w:rFonts w:ascii="Arial" w:hAnsi="Arial" w:cs="Arial"/>
-        </w:rPr>
-        <w:t>una mejor estabilidad actualizando la herramienta utilizada para llevar el control de los préstamos, evitando caídas de plataforma al ser local y nuevas funcionalidades al desarrollarse internamente.</w:t>
+          <w:i/>
+          <w:iCs/>
+        </w:rPr>
+        <w:t>s</w:t>
+      </w:r>
+      <w:r>
+        <w:rPr>
+          <w:rFonts w:ascii="Arial" w:hAnsi="Arial" w:cs="Arial"/>
+          <w:i/>
+          <w:iCs/>
+        </w:rPr>
+        <w:t>:</w:t>
       </w:r>
     </w:p>
     <w:p>
       <w:pPr>
+        <w:ind w:left="708"/>
+        <w:jc w:val="both"/>
         <w:rPr>
           <w:rFonts w:ascii="Arial" w:hAnsi="Arial" w:cs="Arial"/>
         </w:rPr>
@@ -2793,30 +3158,88 @@
         <w:rPr>
           <w:rFonts w:ascii="Arial" w:hAnsi="Arial" w:cs="Arial"/>
         </w:rPr>
-        <w:pict w14:anchorId="13FFF293">
+        <w:t>- Contar con una plataforma que permita gestionar y registrar de manera eficiente los préstamos y devoluciones de equipos, materiales y RF (Radiofrecuencias) del área de suministros.</w:t>
+      </w:r>
+    </w:p>
+    <w:p>
+      <w:pPr>
+        <w:ind w:left="708"/>
+        <w:jc w:val="both"/>
+        <w:rPr>
+          <w:rFonts w:ascii="Arial" w:hAnsi="Arial" w:cs="Arial"/>
+        </w:rPr>
+      </w:pPr>
+      <w:r>
+        <w:rPr>
+          <w:rFonts w:ascii="Arial" w:hAnsi="Arial" w:cs="Arial"/>
+        </w:rPr>
+        <w:t>- Facilitar la trazabilidad mediante el almacenamiento de un historial detallado de movimientos, lo que agiliza la identificación de responsables y la resolución de incidentes.</w:t>
+      </w:r>
+    </w:p>
+    <w:p>
+      <w:pPr>
+        <w:jc w:val="both"/>
+        <w:rPr>
+          <w:rFonts w:ascii="Arial" w:hAnsi="Arial" w:cs="Arial"/>
+        </w:rPr>
+      </w:pPr>
+      <w:r>
+        <w:rPr>
+          <w:rFonts w:ascii="Arial" w:hAnsi="Arial" w:cs="Arial"/>
+        </w:rPr>
+        <w:pict w14:anchorId="5D09B609">
           <v:rect id="_x0000_i1027" style="width:0;height:1.5pt" o:hralign="center" o:hrstd="t" o:hr="t" fillcolor="#a0a0a0" stroked="f"/>
         </w:pict>
       </w:r>
     </w:p>
     <w:p>
       <w:pPr>
+        <w:pStyle w:val="Prrafodelista"/>
+        <w:jc w:val="both"/>
         <w:rPr>
           <w:rFonts w:ascii="Arial" w:hAnsi="Arial" w:cs="Arial"/>
           <w:b/>
           <w:bCs/>
         </w:rPr>
       </w:pPr>
-      <w:r>
+    </w:p>
+    <w:p>
+      <w:pPr>
+        <w:jc w:val="both"/>
         <w:rPr>
           <w:rFonts w:ascii="Arial" w:hAnsi="Arial" w:cs="Arial"/>
           <w:b/>
           <w:bCs/>
         </w:rPr>
-        <w:t>1.2 Objetivo General y Alcance</w:t>
+      </w:pPr>
+    </w:p>
+    <w:p>
+      <w:pPr>
+        <w:pStyle w:val="Prrafodelista"/>
+        <w:numPr>
+          <w:ilvl w:val="0"/>
+          <w:numId w:val="59"/>
+        </w:numPr>
+        <w:jc w:val="both"/>
+        <w:rPr>
+          <w:rFonts w:ascii="Arial" w:hAnsi="Arial" w:cs="Arial"/>
+          <w:b/>
+          <w:bCs/>
+        </w:rPr>
+      </w:pPr>
+      <w:r>
+        <w:rPr>
+          <w:rFonts w:ascii="Arial" w:hAnsi="Arial" w:cs="Arial"/>
+          <w:b/>
+          <w:bCs/>
+        </w:rPr>
+        <w:lastRenderedPageBreak/>
+        <w:t>Funcionalidades del Sistema</w:t>
       </w:r>
     </w:p>
     <w:p>
       <w:pPr>
+        <w:jc w:val="both"/>
         <w:rPr>
           <w:rFonts w:ascii="Arial" w:hAnsi="Arial" w:cs="Arial"/>
         </w:rPr>
@@ -2824,20 +3247,13 @@
       <w:r>
         <w:rPr>
           <w:rFonts w:ascii="Arial" w:hAnsi="Arial" w:cs="Arial"/>
-          <w:b/>
-          <w:bCs/>
-        </w:rPr>
-        <w:t>Propósito:</w:t>
-      </w:r>
-      <w:r>
-        <w:rPr>
-          <w:rFonts w:ascii="Arial" w:hAnsi="Arial" w:cs="Arial"/>
-        </w:rPr>
-        <w:t xml:space="preserve"> Definir metas claras y límites del proyecto.</w:t>
+        </w:rPr>
+        <w:t>Complete el siguiente cuadro para cada funcionalidad que requiera:</w:t>
       </w:r>
     </w:p>
     <w:p>
       <w:pPr>
+        <w:jc w:val="both"/>
         <w:rPr>
           <w:rFonts w:ascii="Arial" w:hAnsi="Arial" w:cs="Arial"/>
         </w:rPr>
@@ -2848,15 +3264,18 @@
           <w:b/>
           <w:bCs/>
         </w:rPr>
-        <w:t>Objetivo General:</w:t>
+        <w:t xml:space="preserve">ID: </w:t>
+      </w:r>
+      <w:r>
+        <w:rPr>
+          <w:rFonts w:ascii="Arial" w:hAnsi="Arial" w:cs="Arial"/>
+        </w:rPr>
+        <w:t>Genere un identificador único de cada funcionalidad</w:t>
       </w:r>
     </w:p>
     <w:p>
       <w:pPr>
-        <w:numPr>
-          <w:ilvl w:val="0"/>
-          <w:numId w:val="57"/>
-        </w:numPr>
+        <w:jc w:val="both"/>
         <w:rPr>
           <w:rFonts w:ascii="Arial" w:hAnsi="Arial" w:cs="Arial"/>
         </w:rPr>
@@ -2864,12 +3283,29 @@
       <w:r>
         <w:rPr>
           <w:rFonts w:ascii="Arial" w:hAnsi="Arial" w:cs="Arial"/>
-        </w:rPr>
-        <w:t>Una declaración clara del resultado final esperado.</w:t>
+          <w:b/>
+          <w:bCs/>
+        </w:rPr>
+        <w:t>C</w:t>
+      </w:r>
+      <w:r>
+        <w:rPr>
+          <w:rFonts w:ascii="Arial" w:hAnsi="Arial" w:cs="Arial"/>
+          <w:b/>
+          <w:bCs/>
+        </w:rPr>
+        <w:t>omo</w:t>
+      </w:r>
+      <w:r>
+        <w:rPr>
+          <w:rFonts w:ascii="Arial" w:hAnsi="Arial" w:cs="Arial"/>
+        </w:rPr>
+        <w:t xml:space="preserve"> (¿Quién usará esta función?)</w:t>
       </w:r>
     </w:p>
     <w:p>
       <w:pPr>
+        <w:jc w:val="both"/>
         <w:rPr>
           <w:rFonts w:ascii="Arial" w:hAnsi="Arial" w:cs="Arial"/>
         </w:rPr>
@@ -2880,7 +3316,80 @@
           <w:b/>
           <w:bCs/>
         </w:rPr>
-        <w:t>Alcance del Proyecto:</w:t>
+        <w:t>Quiero</w:t>
+      </w:r>
+      <w:r>
+        <w:rPr>
+          <w:rFonts w:ascii="Arial" w:hAnsi="Arial" w:cs="Arial"/>
+        </w:rPr>
+        <w:t xml:space="preserve"> (¿Qué acción desea realizar?)</w:t>
+      </w:r>
+    </w:p>
+    <w:p>
+      <w:pPr>
+        <w:spacing w:after="0"/>
+        <w:jc w:val="both"/>
+        <w:rPr>
+          <w:rFonts w:ascii="Arial" w:hAnsi="Arial" w:cs="Arial"/>
+        </w:rPr>
+      </w:pPr>
+      <w:r>
+        <w:rPr>
+          <w:rFonts w:ascii="Arial" w:hAnsi="Arial" w:cs="Arial"/>
+          <w:b/>
+          <w:bCs/>
+        </w:rPr>
+        <w:t>Para</w:t>
+      </w:r>
+      <w:r>
+        <w:rPr>
+          <w:rFonts w:ascii="Arial" w:hAnsi="Arial" w:cs="Arial"/>
+        </w:rPr>
+        <w:t xml:space="preserve"> (¿Qué beneficio obtiene o problema resuelve?)</w:t>
+      </w:r>
+    </w:p>
+    <w:p>
+      <w:pPr>
+        <w:spacing w:after="0"/>
+        <w:jc w:val="both"/>
+        <w:rPr>
+          <w:rFonts w:ascii="Arial" w:hAnsi="Arial" w:cs="Arial"/>
+        </w:rPr>
+      </w:pPr>
+      <w:r>
+        <w:rPr>
+          <w:rFonts w:ascii="Arial" w:hAnsi="Arial" w:cs="Arial"/>
+        </w:rPr>
+        <w:t>Nota: lo que no se especifique en las funcionalidades del sistema no se contempla en el alcance del desarrollo.</w:t>
+      </w:r>
+    </w:p>
+    <w:p>
+      <w:pPr>
+        <w:spacing w:after="0"/>
+        <w:jc w:val="both"/>
+        <w:rPr>
+          <w:rFonts w:ascii="Arial" w:hAnsi="Arial" w:cs="Arial"/>
+        </w:rPr>
+      </w:pPr>
+    </w:p>
+    <w:p>
+      <w:pPr>
+        <w:jc w:val="both"/>
+        <w:rPr>
+          <w:rFonts w:ascii="Arial" w:hAnsi="Arial" w:cs="Arial"/>
+        </w:rPr>
+      </w:pPr>
+      <w:r>
+        <w:rPr>
+          <w:rFonts w:ascii="Arial" w:hAnsi="Arial" w:cs="Arial"/>
+        </w:rPr>
+        <w:t>Adicionalmente debe incluir al final lo siguiente</w:t>
+      </w:r>
+      <w:r>
+        <w:rPr>
+          <w:rFonts w:ascii="Arial" w:hAnsi="Arial" w:cs="Arial"/>
+        </w:rPr>
+        <w:t>:</w:t>
       </w:r>
     </w:p>
     <w:p>
@@ -2889,6 +3398,8 @@
           <w:ilvl w:val="0"/>
           <w:numId w:val="58"/>
         </w:numPr>
+        <w:spacing w:after="0"/>
+        <w:jc w:val="both"/>
         <w:rPr>
           <w:rFonts w:ascii="Arial" w:hAnsi="Arial" w:cs="Arial"/>
         </w:rPr>
@@ -2899,14 +3410,98 @@
           <w:b/>
           <w:bCs/>
         </w:rPr>
-        <w:lastRenderedPageBreak/>
-        <w:t>Incluye:</w:t>
+        <w:t>Que excluye:</w:t>
       </w:r>
       <w:r>
         <w:rPr>
           <w:rFonts w:ascii="Arial" w:hAnsi="Arial" w:cs="Arial"/>
         </w:rPr>
-        <w:t xml:space="preserve"> Funcionalidades que SÍ serán desarrolladas.</w:t>
+        <w:t xml:space="preserve"> Funcionalidades que </w:t>
+      </w:r>
+      <w:r>
+        <w:rPr>
+          <w:rFonts w:ascii="Arial" w:hAnsi="Arial" w:cs="Arial"/>
+          <w:b/>
+          <w:bCs/>
+        </w:rPr>
+        <w:t>NO</w:t>
+      </w:r>
+      <w:r>
+        <w:rPr>
+          <w:rFonts w:ascii="Arial" w:hAnsi="Arial" w:cs="Arial"/>
+        </w:rPr>
+        <w:t xml:space="preserve"> serán desarrolladas</w:t>
+      </w:r>
+      <w:r>
+        <w:rPr>
+          <w:rFonts w:ascii="Arial" w:hAnsi="Arial" w:cs="Arial"/>
+        </w:rPr>
+        <w:t>, en esta fase</w:t>
+      </w:r>
+      <w:r>
+        <w:rPr>
+          <w:rFonts w:ascii="Arial" w:hAnsi="Arial" w:cs="Arial"/>
+        </w:rPr>
+        <w:t>.</w:t>
+      </w:r>
+    </w:p>
+    <w:p>
+      <w:pPr>
+        <w:spacing w:after="0"/>
+        <w:ind w:left="720"/>
+        <w:jc w:val="both"/>
+        <w:rPr>
+          <w:rFonts w:ascii="Arial" w:hAnsi="Arial" w:cs="Arial"/>
+          <w:i/>
+          <w:iCs/>
+        </w:rPr>
+      </w:pPr>
+      <w:r>
+        <w:rPr>
+          <w:rFonts w:ascii="Arial" w:hAnsi="Arial" w:cs="Arial"/>
+          <w:i/>
+          <w:iCs/>
+        </w:rPr>
+        <w:t>Ejemplo:</w:t>
+      </w:r>
+    </w:p>
+    <w:p>
+      <w:pPr>
+        <w:ind w:left="720"/>
+        <w:jc w:val="both"/>
+        <w:rPr>
+          <w:rFonts w:ascii="Arial" w:hAnsi="Arial" w:cs="Arial"/>
+        </w:rPr>
+      </w:pPr>
+      <w:r>
+        <w:rPr>
+          <w:rFonts w:ascii="Arial" w:hAnsi="Arial" w:cs="Arial"/>
+        </w:rPr>
+        <w:t xml:space="preserve">-Excluye el desarrollo </w:t>
+      </w:r>
+      <w:r>
+        <w:rPr>
+          <w:rFonts w:ascii="Arial" w:hAnsi="Arial" w:cs="Arial"/>
+        </w:rPr>
+        <w:t>de</w:t>
+      </w:r>
+      <w:r>
+        <w:rPr>
+          <w:rFonts w:ascii="Arial" w:hAnsi="Arial" w:cs="Arial"/>
+        </w:rPr>
+        <w:t xml:space="preserve"> un </w:t>
+      </w:r>
+      <w:r>
+        <w:rPr>
+          <w:rFonts w:ascii="Arial" w:hAnsi="Arial" w:cs="Arial"/>
+        </w:rPr>
+        <w:t>módulo</w:t>
+      </w:r>
+      <w:r>
+        <w:rPr>
+          <w:rFonts w:ascii="Arial" w:hAnsi="Arial" w:cs="Arial"/>
+        </w:rPr>
+        <w:t xml:space="preserve"> para la gestión de los consumibles que se entregan y gestionan en el área de suministros.</w:t>
       </w:r>
     </w:p>
     <w:p>
@@ -2915,31 +3510,8 @@
           <w:ilvl w:val="0"/>
           <w:numId w:val="58"/>
         </w:numPr>
-        <w:rPr>
-          <w:rFonts w:ascii="Arial" w:hAnsi="Arial" w:cs="Arial"/>
-        </w:rPr>
-      </w:pPr>
-      <w:r>
-        <w:rPr>
-          <w:rFonts w:ascii="Arial" w:hAnsi="Arial" w:cs="Arial"/>
-          <w:b/>
-          <w:bCs/>
-        </w:rPr>
-        <w:t>Excluye:</w:t>
-      </w:r>
-      <w:r>
-        <w:rPr>
-          <w:rFonts w:ascii="Arial" w:hAnsi="Arial" w:cs="Arial"/>
-        </w:rPr>
-        <w:t xml:space="preserve"> Funcionalidades que NO serán desarrolladas.</w:t>
-      </w:r>
-    </w:p>
-    <w:p>
-      <w:pPr>
-        <w:numPr>
-          <w:ilvl w:val="0"/>
-          <w:numId w:val="58"/>
-        </w:numPr>
+        <w:spacing w:after="0"/>
+        <w:jc w:val="both"/>
         <w:rPr>
           <w:rFonts w:ascii="Arial" w:hAnsi="Arial" w:cs="Arial"/>
         </w:rPr>
@@ -2961,135 +3533,63 @@
     </w:p>
     <w:p>
       <w:pPr>
-        <w:rPr>
-          <w:rFonts w:ascii="Arial" w:hAnsi="Arial" w:cs="Arial"/>
+        <w:spacing w:after="0"/>
+        <w:ind w:left="720"/>
+        <w:jc w:val="both"/>
+        <w:rPr>
+          <w:rFonts w:ascii="Arial" w:hAnsi="Arial" w:cs="Arial"/>
+          <w:i/>
+          <w:iCs/>
         </w:rPr>
       </w:pPr>
       <w:r>
         <w:rPr>
           <w:rFonts w:ascii="Arial" w:hAnsi="Arial" w:cs="Arial"/>
-        </w:rPr>
-        <w:pict w14:anchorId="5D09B609">
-          <v:rect id="_x0000_i1028" style="width:0;height:1.5pt" o:hralign="center" o:hrstd="t" o:hr="t" fillcolor="#a0a0a0" stroked="f"/>
-        </w:pict>
+          <w:i/>
+          <w:iCs/>
+        </w:rPr>
+        <w:t>Ejemplo:</w:t>
       </w:r>
     </w:p>
     <w:p>
       <w:pPr>
-        <w:rPr>
-          <w:rFonts w:ascii="Arial" w:hAnsi="Arial" w:cs="Arial"/>
-          <w:b/>
-          <w:bCs/>
+        <w:spacing w:after="0"/>
+        <w:ind w:left="720"/>
+        <w:jc w:val="both"/>
+        <w:rPr>
+          <w:rFonts w:ascii="Arial" w:hAnsi="Arial" w:cs="Arial"/>
         </w:rPr>
       </w:pPr>
       <w:r>
         <w:rPr>
           <w:rFonts w:ascii="Arial" w:hAnsi="Arial" w:cs="Arial"/>
-          <w:b/>
-          <w:bCs/>
-        </w:rPr>
-        <w:t>2. Funcionalidades del Sistema</w:t>
+        </w:rPr>
+        <w:t>-Implementación de informes en Power BI</w:t>
       </w:r>
+      <w:r>
+        <w:rPr>
+          <w:rFonts w:ascii="Arial" w:hAnsi="Arial" w:cs="Arial"/>
+        </w:rPr>
+        <w:t xml:space="preserve"> conectados a la data de base de datos que permita ver estadísticas de los préstamos, en el área nos encontramos en la etapa de construcción de </w:t>
+      </w:r>
+      <w:proofErr w:type="spellStart"/>
+      <w:r>
+        <w:rPr>
+          <w:rFonts w:ascii="Arial" w:hAnsi="Arial" w:cs="Arial"/>
+        </w:rPr>
+        <w:t>KPIs</w:t>
+      </w:r>
+      <w:proofErr w:type="spellEnd"/>
     </w:p>
     <w:p>
       <w:pPr>
-        <w:rPr>
-          <w:rFonts w:ascii="Arial" w:hAnsi="Arial" w:cs="Arial"/>
-        </w:rPr>
-      </w:pPr>
-      <w:r>
-        <w:rPr>
-          <w:rFonts w:ascii="Arial" w:hAnsi="Arial" w:cs="Arial"/>
-        </w:rPr>
-        <w:t>Complete el siguiente cuadro para cada funcionalidad que requiera:</w:t>
-      </w:r>
-    </w:p>
-    <w:p>
-      <w:pPr>
-        <w:rPr>
-          <w:rFonts w:ascii="Arial" w:hAnsi="Arial" w:cs="Arial"/>
-        </w:rPr>
-      </w:pPr>
-      <w:r>
-        <w:rPr>
-          <w:rFonts w:ascii="Arial" w:hAnsi="Arial" w:cs="Arial"/>
-          <w:b/>
-          <w:bCs/>
-        </w:rPr>
-        <w:t>C</w:t>
-      </w:r>
-      <w:r>
-        <w:rPr>
-          <w:rFonts w:ascii="Arial" w:hAnsi="Arial" w:cs="Arial"/>
-          <w:b/>
-          <w:bCs/>
-        </w:rPr>
-        <w:t>omo</w:t>
-      </w:r>
-      <w:r>
-        <w:rPr>
-          <w:rFonts w:ascii="Arial" w:hAnsi="Arial" w:cs="Arial"/>
-        </w:rPr>
-        <w:t xml:space="preserve"> (¿Quién usará esta función?)</w:t>
-      </w:r>
-    </w:p>
-    <w:p>
-      <w:pPr>
-        <w:rPr>
-          <w:rFonts w:ascii="Arial" w:hAnsi="Arial" w:cs="Arial"/>
-        </w:rPr>
-      </w:pPr>
-      <w:r>
-        <w:rPr>
-          <w:rFonts w:ascii="Arial" w:hAnsi="Arial" w:cs="Arial"/>
-          <w:b/>
-          <w:bCs/>
-        </w:rPr>
-        <w:t>Q</w:t>
-      </w:r>
-      <w:r>
-        <w:rPr>
-          <w:rFonts w:ascii="Arial" w:hAnsi="Arial" w:cs="Arial"/>
-          <w:b/>
-          <w:bCs/>
-        </w:rPr>
-        <w:t>uiero</w:t>
-      </w:r>
-      <w:r>
-        <w:rPr>
-          <w:rFonts w:ascii="Arial" w:hAnsi="Arial" w:cs="Arial"/>
-        </w:rPr>
-        <w:t xml:space="preserve"> (¿Qué acción desea realizar?)</w:t>
-      </w:r>
-    </w:p>
-    <w:p>
-      <w:pPr>
-        <w:rPr>
-          <w:rFonts w:ascii="Arial" w:hAnsi="Arial" w:cs="Arial"/>
-        </w:rPr>
-      </w:pPr>
-      <w:r>
-        <w:rPr>
-          <w:rFonts w:ascii="Arial" w:hAnsi="Arial" w:cs="Arial"/>
-          <w:b/>
-          <w:bCs/>
-        </w:rPr>
-        <w:t>P</w:t>
-      </w:r>
-      <w:r>
-        <w:rPr>
-          <w:rFonts w:ascii="Arial" w:hAnsi="Arial" w:cs="Arial"/>
-          <w:b/>
-          <w:bCs/>
-        </w:rPr>
-        <w:t>ara</w:t>
-      </w:r>
-      <w:r>
-        <w:rPr>
-          <w:rFonts w:ascii="Arial" w:hAnsi="Arial" w:cs="Arial"/>
-        </w:rPr>
-        <w:t xml:space="preserve"> (¿Qué beneficio obtiene o problema resuelve?)</w:t>
-      </w:r>
+        <w:spacing w:after="0"/>
+        <w:ind w:left="720"/>
+        <w:jc w:val="both"/>
+        <w:rPr>
+          <w:rFonts w:ascii="Arial" w:hAnsi="Arial" w:cs="Arial"/>
+        </w:rPr>
+      </w:pPr>
     </w:p>
     <w:tbl>
       <w:tblPr>
@@ -3106,11 +3606,11 @@
       <w:tr>
         <w:tc>
           <w:tcPr>
-            <w:tcW w:w="846" w:type="dxa"/>
+            <w:tcW w:w="1084" w:type="dxa"/>
           </w:tcPr>
           <w:p>
             <w:pPr>
-              <w:jc w:val="center"/>
+              <w:jc w:val="both"/>
               <w:rPr>
                 <w:rFonts w:ascii="Arial" w:hAnsi="Arial" w:cs="Arial"/>
                 <w:b/>
@@ -3129,11 +3629,11 @@
         </w:tc>
         <w:tc>
           <w:tcPr>
-            <w:tcW w:w="2835" w:type="dxa"/>
+            <w:tcW w:w="2745" w:type="dxa"/>
           </w:tcPr>
           <w:p>
             <w:pPr>
-              <w:jc w:val="center"/>
+              <w:jc w:val="both"/>
               <w:rPr>
                 <w:rFonts w:ascii="Arial" w:hAnsi="Arial" w:cs="Arial"/>
                 <w:b/>
@@ -3152,11 +3652,11 @@
         </w:tc>
         <w:tc>
           <w:tcPr>
-            <w:tcW w:w="2940" w:type="dxa"/>
+            <w:tcW w:w="2839" w:type="dxa"/>
           </w:tcPr>
           <w:p>
             <w:pPr>
-              <w:jc w:val="center"/>
+              <w:jc w:val="both"/>
               <w:rPr>
                 <w:rFonts w:ascii="Arial" w:hAnsi="Arial" w:cs="Arial"/>
                 <w:b/>
@@ -3175,11 +3675,11 @@
         </w:tc>
         <w:tc>
           <w:tcPr>
-            <w:tcW w:w="2207" w:type="dxa"/>
+            <w:tcW w:w="2160" w:type="dxa"/>
           </w:tcPr>
           <w:p>
             <w:pPr>
-              <w:jc w:val="center"/>
+              <w:jc w:val="both"/>
               <w:rPr>
                 <w:rFonts w:ascii="Arial" w:hAnsi="Arial" w:cs="Arial"/>
                 <w:b/>
@@ -3200,10 +3700,11 @@
       <w:tr>
         <w:tc>
           <w:tcPr>
-            <w:tcW w:w="846" w:type="dxa"/>
+            <w:tcW w:w="1084" w:type="dxa"/>
           </w:tcPr>
           <w:p>
             <w:pPr>
+              <w:jc w:val="both"/>
               <w:rPr>
                 <w:rFonts w:ascii="Arial" w:hAnsi="Arial" w:cs="Arial"/>
               </w:rPr>
@@ -3212,16 +3713,17 @@
               <w:rPr>
                 <w:rFonts w:ascii="Arial" w:hAnsi="Arial" w:cs="Arial"/>
               </w:rPr>
-              <w:t>Ejemplo</w:t>
+              <w:t>Req_01</w:t>
             </w:r>
           </w:p>
         </w:tc>
         <w:tc>
           <w:tcPr>
-            <w:tcW w:w="2835" w:type="dxa"/>
+            <w:tcW w:w="2745" w:type="dxa"/>
           </w:tcPr>
           <w:p>
             <w:pPr>
+              <w:jc w:val="both"/>
               <w:rPr>
                 <w:rFonts w:ascii="Arial" w:hAnsi="Arial" w:cs="Arial"/>
               </w:rPr>
@@ -3236,10 +3738,11 @@
         </w:tc>
         <w:tc>
           <w:tcPr>
-            <w:tcW w:w="2940" w:type="dxa"/>
+            <w:tcW w:w="2839" w:type="dxa"/>
           </w:tcPr>
           <w:p>
             <w:pPr>
+              <w:jc w:val="both"/>
               <w:rPr>
                 <w:rFonts w:ascii="Arial" w:hAnsi="Arial" w:cs="Arial"/>
               </w:rPr>
@@ -3254,10 +3757,11 @@
         </w:tc>
         <w:tc>
           <w:tcPr>
-            <w:tcW w:w="2207" w:type="dxa"/>
+            <w:tcW w:w="2160" w:type="dxa"/>
           </w:tcPr>
           <w:p>
             <w:pPr>
+              <w:jc w:val="both"/>
               <w:rPr>
                 <w:rFonts w:ascii="Arial" w:hAnsi="Arial" w:cs="Arial"/>
               </w:rPr>
@@ -3274,10 +3778,11 @@
       <w:tr>
         <w:tc>
           <w:tcPr>
-            <w:tcW w:w="846" w:type="dxa"/>
+            <w:tcW w:w="1084" w:type="dxa"/>
           </w:tcPr>
           <w:p>
             <w:pPr>
+              <w:jc w:val="both"/>
               <w:rPr>
                 <w:rFonts w:ascii="Arial" w:hAnsi="Arial" w:cs="Arial"/>
               </w:rPr>
@@ -3286,10 +3791,11 @@
         </w:tc>
         <w:tc>
           <w:tcPr>
-            <w:tcW w:w="2835" w:type="dxa"/>
+            <w:tcW w:w="2745" w:type="dxa"/>
           </w:tcPr>
           <w:p>
             <w:pPr>
+              <w:jc w:val="both"/>
               <w:rPr>
                 <w:rFonts w:ascii="Arial" w:hAnsi="Arial" w:cs="Arial"/>
               </w:rPr>
@@ -3298,10 +3804,11 @@
         </w:tc>
         <w:tc>
           <w:tcPr>
-            <w:tcW w:w="2940" w:type="dxa"/>
+            <w:tcW w:w="2839" w:type="dxa"/>
           </w:tcPr>
           <w:p>
             <w:pPr>
+              <w:jc w:val="both"/>
               <w:rPr>
                 <w:rFonts w:ascii="Arial" w:hAnsi="Arial" w:cs="Arial"/>
               </w:rPr>
@@ -3310,10 +3817,11 @@
         </w:tc>
         <w:tc>
           <w:tcPr>
-            <w:tcW w:w="2207" w:type="dxa"/>
+            <w:tcW w:w="2160" w:type="dxa"/>
           </w:tcPr>
           <w:p>
             <w:pPr>
+              <w:jc w:val="both"/>
               <w:rPr>
                 <w:rFonts w:ascii="Arial" w:hAnsi="Arial" w:cs="Arial"/>
               </w:rPr>
@@ -3324,10 +3832,11 @@
       <w:tr>
         <w:tc>
           <w:tcPr>
-            <w:tcW w:w="846" w:type="dxa"/>
+            <w:tcW w:w="1084" w:type="dxa"/>
           </w:tcPr>
           <w:p>
             <w:pPr>
+              <w:jc w:val="both"/>
               <w:rPr>
                 <w:rFonts w:ascii="Arial" w:hAnsi="Arial" w:cs="Arial"/>
               </w:rPr>
@@ -3336,10 +3845,11 @@
         </w:tc>
         <w:tc>
           <w:tcPr>
-            <w:tcW w:w="2835" w:type="dxa"/>
+            <w:tcW w:w="2745" w:type="dxa"/>
           </w:tcPr>
           <w:p>
             <w:pPr>
+              <w:jc w:val="both"/>
               <w:rPr>
                 <w:rFonts w:ascii="Arial" w:hAnsi="Arial" w:cs="Arial"/>
               </w:rPr>
@@ -3348,10 +3858,11 @@
         </w:tc>
         <w:tc>
           <w:tcPr>
-            <w:tcW w:w="2940" w:type="dxa"/>
+            <w:tcW w:w="2839" w:type="dxa"/>
           </w:tcPr>
           <w:p>
             <w:pPr>
+              <w:jc w:val="both"/>
               <w:rPr>
                 <w:rFonts w:ascii="Arial" w:hAnsi="Arial" w:cs="Arial"/>
               </w:rPr>
@@ -3360,10 +3871,11 @@
         </w:tc>
         <w:tc>
           <w:tcPr>
-            <w:tcW w:w="2207" w:type="dxa"/>
+            <w:tcW w:w="2160" w:type="dxa"/>
           </w:tcPr>
           <w:p>
             <w:pPr>
+              <w:jc w:val="both"/>
               <w:rPr>
                 <w:rFonts w:ascii="Arial" w:hAnsi="Arial" w:cs="Arial"/>
               </w:rPr>
@@ -3374,10 +3886,11 @@
       <w:tr>
         <w:tc>
           <w:tcPr>
-            <w:tcW w:w="846" w:type="dxa"/>
+            <w:tcW w:w="1084" w:type="dxa"/>
           </w:tcPr>
           <w:p>
             <w:pPr>
+              <w:jc w:val="both"/>
               <w:rPr>
                 <w:rFonts w:ascii="Arial" w:hAnsi="Arial" w:cs="Arial"/>
               </w:rPr>
@@ -3386,10 +3899,11 @@
         </w:tc>
         <w:tc>
           <w:tcPr>
-            <w:tcW w:w="2835" w:type="dxa"/>
+            <w:tcW w:w="2745" w:type="dxa"/>
           </w:tcPr>
           <w:p>
             <w:pPr>
+              <w:jc w:val="both"/>
               <w:rPr>
                 <w:rFonts w:ascii="Arial" w:hAnsi="Arial" w:cs="Arial"/>
               </w:rPr>
@@ -3398,10 +3912,11 @@
         </w:tc>
         <w:tc>
           <w:tcPr>
-            <w:tcW w:w="2940" w:type="dxa"/>
+            <w:tcW w:w="2839" w:type="dxa"/>
           </w:tcPr>
           <w:p>
             <w:pPr>
+              <w:jc w:val="both"/>
               <w:rPr>
                 <w:rFonts w:ascii="Arial" w:hAnsi="Arial" w:cs="Arial"/>
               </w:rPr>
@@ -3410,10 +3925,11 @@
         </w:tc>
         <w:tc>
           <w:tcPr>
-            <w:tcW w:w="2207" w:type="dxa"/>
+            <w:tcW w:w="2160" w:type="dxa"/>
           </w:tcPr>
           <w:p>
             <w:pPr>
+              <w:jc w:val="both"/>
               <w:rPr>
                 <w:rFonts w:ascii="Arial" w:hAnsi="Arial" w:cs="Arial"/>
               </w:rPr>
@@ -3430,8 +3946,9 @@
       </w:pPr>
     </w:p>
     <w:sectPr>
+      <w:footerReference w:type="default" r:id="rId11"/>
       <w:pgSz w:w="12240" w:h="15840"/>
-      <w:pgMar w:top="1417" w:right="1701" w:bottom="1417" w:left="1701" w:header="708" w:footer="708" w:gutter="0"/>
+      <w:pgMar w:top="1417" w:right="1701" w:bottom="1417" w:left="1701" w:header="708" w:footer="283" w:gutter="0"/>
       <w:cols w:space="708"/>
       <w:docGrid w:linePitch="360"/>
     </w:sectPr>
@@ -3439,11 +3956,121 @@
 </w:document>
 </file>
 
+<file path=word/endnotes.xml><?xml version="1.0" encoding="utf-8"?>
+<w:endnotes xmlns:wpc="http://schemas.microsoft.com/office/word/2010/wordprocessingCanvas" xmlns:cx="http://schemas.microsoft.com/office/drawing/2014/chartex" xmlns:cx1="http://schemas.microsoft.com/office/drawing/2015/9/8/chartex" xmlns:cx2="http://schemas.microsoft.com/office/drawing/2015/10/21/chartex" xmlns:cx3="http://schemas.microsoft.com/office/drawing/2016/5/9/chartex" xmlns:cx4="http://schemas.microsoft.com/office/drawing/2016/5/10/chartex" xmlns:cx5="http://schemas.microsoft.com/office/drawing/2016/5/11/chartex" xmlns:cx6="http://schemas.microsoft.com/office/drawing/2016/5/12/chartex" xmlns:cx7="http://schemas.microsoft.com/office/drawing/2016/5/13/chartex" xmlns:cx8="http://schemas.microsoft.com/office/drawing/2016/5/14/chartex" xmlns:mc="http://schemas.openxmlformats.org/markup-compatibility/2006" xmlns:aink="http://schemas.microsoft.com/office/drawing/2016/ink" xmlns:am3d="http://schemas.microsoft.com/office/drawing/2017/model3d" xmlns:o="urn:schemas-microsoft-com:office:office" xmlns:oel="http://schemas.microsoft.com/office/2019/extlst" xmlns:r="http://schemas.openxmlformats.org/officeDocument/2006/relationships" xmlns:m="http://schemas.openxmlformats.org/officeDocument/2006/math" xmlns:v="urn:schemas-microsoft-com:vml" xmlns:wp14="http://schemas.microsoft.com/office/word/2010/wordprocessingDrawing" xmlns:wp="http://schemas.openxmlformats.org/drawingml/2006/wordprocessingDrawing" xmlns:w10="urn:schemas-microsoft-com:office:word" xmlns:w="http://schemas.openxmlformats.org/wordprocessingml/2006/main" xmlns:w14="http://schemas.microsoft.com/office/word/2010/wordml" xmlns:w15="http://schemas.microsoft.com/office/word/2012/wordml" xmlns:w16cex="http://schemas.microsoft.com/office/word/2018/wordml/cex" xmlns:w16cid="http://schemas.microsoft.com/office/word/2016/wordml/cid" xmlns:w16="http://schemas.microsoft.com/office/word/2018/wordml" xmlns:w16du="http://schemas.microsoft.com/office/word/2023/wordml/word16du" xmlns:w16sdtdh="http://schemas.microsoft.com/office/word/2020/wordml/sdtdatahash" xmlns:w16sdtfl="http://schemas.microsoft.com/office/word/2024/wordml/sdtformatlock" xmlns:w16se="http://schemas.microsoft.com/office/word/2015/wordml/symex" xmlns:wpg="http://schemas.microsoft.com/office/word/2010/wordprocessingGroup" xmlns:wpi="http://schemas.microsoft.com/office/word/2010/wordprocessingInk" xmlns:wne="http://schemas.microsoft.com/office/word/2006/wordml" xmlns:wps="http://schemas.microsoft.com/office/word/2010/wordprocessingShape" mc:Ignorable="w14 w15 w16se w16cid w16 w16cex w16sdtdh w16sdtfl w16du wp14">
+  <w:endnote w:type="separator" w:id="-1">
+    <w:p>
+      <w:pPr>
+        <w:spacing w:after="0" w:line="240" w:lineRule="auto"/>
+      </w:pPr>
+      <w:r>
+        <w:separator/>
+      </w:r>
+    </w:p>
+  </w:endnote>
+  <w:endnote w:type="continuationSeparator" w:id="0">
+    <w:p>
+      <w:pPr>
+        <w:spacing w:after="0" w:line="240" w:lineRule="auto"/>
+      </w:pPr>
+      <w:r>
+        <w:continuationSeparator/>
+      </w:r>
+    </w:p>
+  </w:endnote>
+</w:endnotes>
+</file>
+
+<file path=word/footer1.xml><?xml version="1.0" encoding="utf-8"?>
+<w:ftr xmlns:wpc="http://schemas.microsoft.com/office/word/2010/wordprocessingCanvas" xmlns:cx="http://schemas.microsoft.com/office/drawing/2014/chartex" xmlns:cx1="http://schemas.microsoft.com/office/drawing/2015/9/8/chartex" xmlns:cx2="http://schemas.microsoft.com/office/drawing/2015/10/21/chartex" xmlns:cx3="http://schemas.microsoft.com/office/drawing/2016/5/9/chartex" xmlns:cx4="http://schemas.microsoft.com/office/drawing/2016/5/10/chartex" xmlns:cx5="http://schemas.microsoft.com/office/drawing/2016/5/11/chartex" xmlns:cx6="http://schemas.microsoft.com/office/drawing/2016/5/12/chartex" xmlns:cx7="http://schemas.microsoft.com/office/drawing/2016/5/13/chartex" xmlns:cx8="http://schemas.microsoft.com/office/drawing/2016/5/14/chartex" xmlns:mc="http://schemas.openxmlformats.org/markup-compatibility/2006" xmlns:aink="http://schemas.microsoft.com/office/drawing/2016/ink" xmlns:am3d="http://schemas.microsoft.com/office/drawing/2017/model3d" xmlns:o="urn:schemas-microsoft-com:office:office" xmlns:oel="http://schemas.microsoft.com/office/2019/extlst" xmlns:r="http://schemas.openxmlformats.org/officeDocument/2006/relationships" xmlns:m="http://schemas.openxmlformats.org/officeDocument/2006/math" xmlns:v="urn:schemas-microsoft-com:vml" xmlns:wp14="http://schemas.microsoft.com/office/word/2010/wordprocessingDrawing" xmlns:wp="http://schemas.openxmlformats.org/drawingml/2006/wordprocessingDrawing" xmlns:w10="urn:schemas-microsoft-com:office:word" xmlns:w="http://schemas.openxmlformats.org/wordprocessingml/2006/main" xmlns:w14="http://schemas.microsoft.com/office/word/2010/wordml" xmlns:w15="http://schemas.microsoft.com/office/word/2012/wordml" xmlns:w16cex="http://schemas.microsoft.com/office/word/2018/wordml/cex" xmlns:w16cid="http://schemas.microsoft.com/office/word/2016/wordml/cid" xmlns:w16="http://schemas.microsoft.com/office/word/2018/wordml" xmlns:w16du="http://schemas.microsoft.com/office/word/2023/wordml/word16du" xmlns:w16sdtdh="http://schemas.microsoft.com/office/word/2020/wordml/sdtdatahash" xmlns:w16sdtfl="http://schemas.microsoft.com/office/word/2024/wordml/sdtformatlock" xmlns:w16se="http://schemas.microsoft.com/office/word/2015/wordml/symex" xmlns:wpg="http://schemas.microsoft.com/office/word/2010/wordprocessingGroup" xmlns:wpi="http://schemas.microsoft.com/office/word/2010/wordprocessingInk" xmlns:wne="http://schemas.microsoft.com/office/word/2006/wordml" xmlns:wps="http://schemas.microsoft.com/office/word/2010/wordprocessingShape" mc:Ignorable="w14 w15 w16se w16cid w16 w16cex w16sdtdh w16sdtfl w16du wp14">
+  <w:p>
+    <w:pPr>
+      <w:pStyle w:val="Piedepgina"/>
+      <w:rPr>
+        <w:rFonts w:ascii="Arial" w:hAnsi="Arial" w:cs="Arial"/>
+        <w:sz w:val="10"/>
+        <w:szCs w:val="10"/>
+      </w:rPr>
+    </w:pPr>
+    <w:r>
+      <w:rPr>
+        <w:rFonts w:ascii="Arial" w:hAnsi="Arial" w:cs="Arial"/>
+        <w:sz w:val="10"/>
+        <w:szCs w:val="10"/>
+      </w:rPr>
+      <w:t xml:space="preserve">20260317 v2 </w:t>
+    </w:r>
+    <w:r>
+      <w:rPr>
+        <w:rFonts w:ascii="Arial" w:hAnsi="Arial" w:cs="Arial"/>
+        <w:sz w:val="10"/>
+        <w:szCs w:val="10"/>
+      </w:rPr>
+      <w:t>r</w:t>
+    </w:r>
+    <w:r>
+      <w:rPr>
+        <w:rFonts w:ascii="Arial" w:hAnsi="Arial" w:cs="Arial"/>
+        <w:sz w:val="10"/>
+        <w:szCs w:val="10"/>
+      </w:rPr>
+      <w:t>evisada por</w:t>
+    </w:r>
+    <w:r>
+      <w:rPr>
+        <w:rFonts w:ascii="Arial" w:hAnsi="Arial" w:cs="Arial"/>
+        <w:sz w:val="10"/>
+        <w:szCs w:val="10"/>
+      </w:rPr>
+      <w:t>:</w:t>
+    </w:r>
+    <w:r>
+      <w:rPr>
+        <w:rFonts w:ascii="Arial" w:hAnsi="Arial" w:cs="Arial"/>
+        <w:sz w:val="10"/>
+        <w:szCs w:val="10"/>
+      </w:rPr>
+      <w:t xml:space="preserve"> ALEXANDER LONDONO PINEDA</w:t>
+    </w:r>
+  </w:p>
+  <w:p>
+    <w:pPr>
+      <w:pStyle w:val="Piedepgina"/>
+    </w:pPr>
+  </w:p>
+</w:ftr>
+</file>
+
+<file path=word/footnotes.xml><?xml version="1.0" encoding="utf-8"?>
+<w:footnotes xmlns:wpc="http://schemas.microsoft.com/office/word/2010/wordprocessingCanvas" xmlns:cx="http://schemas.microsoft.com/office/drawing/2014/chartex" xmlns:cx1="http://schemas.microsoft.com/office/drawing/2015/9/8/chartex" xmlns:cx2="http://schemas.microsoft.com/office/drawing/2015/10/21/chartex" xmlns:cx3="http://schemas.microsoft.com/office/drawing/2016/5/9/chartex" xmlns:cx4="http://schemas.microsoft.com/office/drawing/2016/5/10/chartex" xmlns:cx5="http://schemas.microsoft.com/office/drawing/2016/5/11/chartex" xmlns:cx6="http://schemas.microsoft.com/office/drawing/2016/5/12/chartex" xmlns:cx7="http://schemas.microsoft.com/office/drawing/2016/5/13/chartex" xmlns:cx8="http://schemas.microsoft.com/office/drawing/2016/5/14/chartex" xmlns:mc="http://schemas.openxmlformats.org/markup-compatibility/2006" xmlns:aink="http://schemas.microsoft.com/office/drawing/2016/ink" xmlns:am3d="http://schemas.microsoft.com/office/drawing/2017/model3d" xmlns:o="urn:schemas-microsoft-com:office:office" xmlns:oel="http://schemas.microsoft.com/office/2019/extlst" xmlns:r="http://schemas.openxmlformats.org/officeDocument/2006/relationships" xmlns:m="http://schemas.openxmlformats.org/officeDocument/2006/math" xmlns:v="urn:schemas-microsoft-com:vml" xmlns:wp14="http://schemas.microsoft.com/office/word/2010/wordprocessingDrawing" xmlns:wp="http://schemas.openxmlformats.org/drawingml/2006/wordprocessingDrawing" xmlns:w10="urn:schemas-microsoft-com:office:word" xmlns:w="http://schemas.openxmlformats.org/wordprocessingml/2006/main" xmlns:w14="http://schemas.microsoft.com/office/word/2010/wordml" xmlns:w15="http://schemas.microsoft.com/office/word/2012/wordml" xmlns:w16cex="http://schemas.microsoft.com/office/word/2018/wordml/cex" xmlns:w16cid="http://schemas.microsoft.com/office/word/2016/wordml/cid" xmlns:w16="http://schemas.microsoft.com/office/word/2018/wordml" xmlns:w16du="http://schemas.microsoft.com/office/word/2023/wordml/word16du" xmlns:w16sdtdh="http://schemas.microsoft.com/office/word/2020/wordml/sdtdatahash" xmlns:w16sdtfl="http://schemas.microsoft.com/office/word/2024/wordml/sdtformatlock" xmlns:w16se="http://schemas.microsoft.com/office/word/2015/wordml/symex" xmlns:wpg="http://schemas.microsoft.com/office/word/2010/wordprocessingGroup" xmlns:wpi="http://schemas.microsoft.com/office/word/2010/wordprocessingInk" xmlns:wne="http://schemas.microsoft.com/office/word/2006/wordml" xmlns:wps="http://schemas.microsoft.com/office/word/2010/wordprocessingShape" mc:Ignorable="w14 w15 w16se w16cid w16 w16cex w16sdtdh w16sdtfl w16du wp14">
+  <w:footnote w:type="separator" w:id="-1">
+    <w:p>
+      <w:pPr>
+        <w:spacing w:after="0" w:line="240" w:lineRule="auto"/>
+      </w:pPr>
+      <w:r>
+        <w:separator/>
+      </w:r>
+    </w:p>
+  </w:footnote>
+  <w:footnote w:type="continuationSeparator" w:id="0">
+    <w:p>
+      <w:pPr>
+        <w:spacing w:after="0" w:line="240" w:lineRule="auto"/>
+      </w:pPr>
+      <w:r>
+        <w:continuationSeparator/>
+      </w:r>
+    </w:p>
+  </w:footnote>
+</w:footnotes>
+</file>
+
 <file path=word/numbering.xml><?xml version="1.0" encoding="utf-8"?>
 <w:numbering xmlns:wpc="http://schemas.microsoft.com/office/word/2010/wordprocessingCanvas" xmlns:cx="http://schemas.microsoft.com/office/drawing/2014/chartex" xmlns:cx1="http://schemas.microsoft.com/office/drawing/2015/9/8/chartex" xmlns:cx2="http://schemas.microsoft.com/office/drawing/2015/10/21/chartex" xmlns:cx3="http://schemas.microsoft.com/office/drawing/2016/5/9/chartex" xmlns:cx4="http://schemas.microsoft.com/office/drawing/2016/5/10/chartex" xmlns:cx5="http://schemas.microsoft.com/office/drawing/2016/5/11/chartex" xmlns:cx6="http://schemas.microsoft.com/office/drawing/2016/5/12/chartex" xmlns:cx7="http://schemas.microsoft.com/office/drawing/2016/5/13/chartex" xmlns:cx8="http://schemas.microsoft.com/office/drawing/2016/5/14/chartex" xmlns:mc="http://schemas.openxmlformats.org/markup-compatibility/2006" xmlns:aink="http://schemas.microsoft.com/office/drawing/2016/ink" xmlns:am3d="http://schemas.microsoft.com/office/drawing/2017/model3d" xmlns:o="urn:schemas-microsoft-com:office:office" xmlns:oel="http://schemas.microsoft.com/office/2019/extlst" xmlns:r="http://schemas.openxmlformats.org/officeDocument/2006/relationships" xmlns:m="http://schemas.openxmlformats.org/officeDocument/2006/math" xmlns:v="urn:schemas-microsoft-com:vml" xmlns:wp14="http://schemas.microsoft.com/office/word/2010/wordprocessingDrawing" xmlns:wp="http://schemas.openxmlformats.org/drawingml/2006/wordprocessingDrawing" xmlns:w10="urn:schemas-microsoft-com:office:word" xmlns:w="http://schemas.openxmlformats.org/wordprocessingml/2006/main" xmlns:w14="http://schemas.microsoft.com/office/word/2010/wordml" xmlns:w15="http://schemas.microsoft.com/office/word/2012/wordml" xmlns:w16cex="http://schemas.microsoft.com/office/word/2018/wordml/cex" xmlns:w16cid="http://schemas.microsoft.com/office/word/2016/wordml/cid" xmlns:w16="http://schemas.microsoft.com/office/word/2018/wordml" xmlns:w16du="http://schemas.microsoft.com/office/word/2023/wordml/word16du" xmlns:w16sdtdh="http://schemas.microsoft.com/office/word/2020/wordml/sdtdatahash" xmlns:w16sdtfl="http://schemas.microsoft.com/office/word/2024/wordml/sdtformatlock" xmlns:w16se="http://schemas.microsoft.com/office/word/2015/wordml/symex" xmlns:wpg="http://schemas.microsoft.com/office/word/2010/wordprocessingGroup" xmlns:wpi="http://schemas.microsoft.com/office/word/2010/wordprocessingInk" xmlns:wne="http://schemas.microsoft.com/office/word/2006/wordml" xmlns:wps="http://schemas.microsoft.com/office/word/2010/wordprocessingShape" mc:Ignorable="w14 w15 w16se w16cid w16 w16cex w16sdtdh w16sdtfl w16du wp14">
   <w:numPicBullet w:numPicBulletId="0">
     <w:pict>
-      <v:rect id="_x0000_i1041" style="width:0;height:1.5pt" o:hralign="center" o:bullet="t" o:hrstd="t" o:hr="t" fillcolor="#a0a0a0" stroked="f"/>
+      <v:rect w14:anchorId="75A4CD7A" id="_x0000_i1025" style="width:0;height:1.5pt" o:hralign="center" o:bullet="t" o:hrstd="t" o:hr="t" fillcolor="#a0a0a0" stroked="f"/>
     </w:pict>
   </w:numPicBullet>
   <w:abstractNum w:abstractNumId="0" w15:restartNumberingAfterBreak="0">
@@ -10614,6 +11241,96 @@
     </w:lvl>
   </w:abstractNum>
   <w:abstractNum w:abstractNumId="54" w15:restartNumberingAfterBreak="0">
+    <w:nsid w:val="6CB705B3"/>
+    <w:multiLevelType w:val="hybridMultilevel"/>
+    <w:tmpl w:val="4154B4F4"/>
+    <w:lvl w:ilvl="0" w:tplc="B808ABB8">
+      <w:start w:val="1"/>
+      <w:numFmt w:val="decimal"/>
+      <w:lvlText w:val="%1."/>
+      <w:lvlJc w:val="left"/>
+      <w:pPr>
+        <w:ind w:left="720" w:hanging="360"/>
+      </w:pPr>
+      <w:rPr>
+        <w:rFonts w:hint="default"/>
+        <w:b/>
+      </w:rPr>
+    </w:lvl>
+    <w:lvl w:ilvl="1" w:tplc="240A0019" w:tentative="1">
+      <w:start w:val="1"/>
+      <w:numFmt w:val="lowerLetter"/>
+      <w:lvlText w:val="%2."/>
+      <w:lvlJc w:val="left"/>
+      <w:pPr>
+        <w:ind w:left="1440" w:hanging="360"/>
+      </w:pPr>
+    </w:lvl>
+    <w:lvl w:ilvl="2" w:tplc="240A001B" w:tentative="1">
+      <w:start w:val="1"/>
+      <w:numFmt w:val="lowerRoman"/>
+      <w:lvlText w:val="%3."/>
+      <w:lvlJc w:val="right"/>
+      <w:pPr>
+        <w:ind w:left="2160" w:hanging="180"/>
+      </w:pPr>
+    </w:lvl>
+    <w:lvl w:ilvl="3" w:tplc="240A000F" w:tentative="1">
+      <w:start w:val="1"/>
+      <w:numFmt w:val="decimal"/>
+      <w:lvlText w:val="%4."/>
+      <w:lvlJc w:val="left"/>
+      <w:pPr>
+        <w:ind w:left="2880" w:hanging="360"/>
+      </w:pPr>
+    </w:lvl>
+    <w:lvl w:ilvl="4" w:tplc="240A0019" w:tentative="1">
+      <w:start w:val="1"/>
+      <w:numFmt w:val="lowerLetter"/>
+      <w:lvlText w:val="%5."/>
+      <w:lvlJc w:val="left"/>
+      <w:pPr>
+        <w:ind w:left="3600" w:hanging="360"/>
+      </w:pPr>
+    </w:lvl>
+    <w:lvl w:ilvl="5" w:tplc="240A001B" w:tentative="1">
+      <w:start w:val="1"/>
+      <w:numFmt w:val="lowerRoman"/>
+      <w:lvlText w:val="%6."/>
+      <w:lvlJc w:val="right"/>
+      <w:pPr>
+        <w:ind w:left="4320" w:hanging="180"/>
+      </w:pPr>
+    </w:lvl>
+    <w:lvl w:ilvl="6" w:tplc="240A000F" w:tentative="1">
+      <w:start w:val="1"/>
+      <w:numFmt w:val="decimal"/>
+      <w:lvlText w:val="%7."/>
+      <w:lvlJc w:val="left"/>
+      <w:pPr>
+        <w:ind w:left="5040" w:hanging="360"/>
+      </w:pPr>
+    </w:lvl>
+    <w:lvl w:ilvl="7" w:tplc="240A0019" w:tentative="1">
+      <w:start w:val="1"/>
+      <w:numFmt w:val="lowerLetter"/>
+      <w:lvlText w:val="%8."/>
+      <w:lvlJc w:val="left"/>
+      <w:pPr>
+        <w:ind w:left="5760" w:hanging="360"/>
+      </w:pPr>
+    </w:lvl>
+    <w:lvl w:ilvl="8" w:tplc="240A001B" w:tentative="1">
+      <w:start w:val="1"/>
+      <w:numFmt w:val="lowerRoman"/>
+      <w:lvlText w:val="%9."/>
+      <w:lvlJc w:val="right"/>
+      <w:pPr>
+        <w:ind w:left="6480" w:hanging="180"/>
+      </w:pPr>
+    </w:lvl>
+  </w:abstractNum>
+  <w:abstractNum w:abstractNumId="55" w15:restartNumberingAfterBreak="0">
     <w:nsid w:val="6F0433CB"/>
     <w:multiLevelType w:val="multilevel"/>
     <w:tmpl w:val="80B62C76"/>
@@ -10762,7 +11479,7 @@
       </w:rPr>
     </w:lvl>
   </w:abstractNum>
-  <w:abstractNum w:abstractNumId="55" w15:restartNumberingAfterBreak="0">
+  <w:abstractNum w:abstractNumId="56" w15:restartNumberingAfterBreak="0">
     <w:nsid w:val="6F8F0D1E"/>
     <w:multiLevelType w:val="multilevel"/>
     <w:tmpl w:val="C9484A74"/>
@@ -10911,7 +11628,7 @@
       </w:rPr>
     </w:lvl>
   </w:abstractNum>
-  <w:abstractNum w:abstractNumId="56" w15:restartNumberingAfterBreak="0">
+  <w:abstractNum w:abstractNumId="57" w15:restartNumberingAfterBreak="0">
     <w:nsid w:val="758D7A57"/>
     <w:multiLevelType w:val="multilevel"/>
     <w:tmpl w:val="7CC6166A"/>
@@ -11060,7 +11777,7 @@
       </w:rPr>
     </w:lvl>
   </w:abstractNum>
-  <w:abstractNum w:abstractNumId="57" w15:restartNumberingAfterBreak="0">
+  <w:abstractNum w:abstractNumId="58" w15:restartNumberingAfterBreak="0">
     <w:nsid w:val="7DCD0878"/>
     <w:multiLevelType w:val="multilevel"/>
     <w:tmpl w:val="22B620A8"/>
@@ -11219,7 +11936,7 @@
     <w:abstractNumId w:val="16"/>
   </w:num>
   <w:num w:numId="4" w16cid:durableId="1844929506">
-    <w:abstractNumId w:val="55"/>
+    <w:abstractNumId w:val="56"/>
   </w:num>
   <w:num w:numId="5" w16cid:durableId="1716077376">
     <w:abstractNumId w:val="7"/>
@@ -11261,7 +11978,7 @@
     <w:abstractNumId w:val="36"/>
   </w:num>
   <w:num w:numId="18" w16cid:durableId="618802778">
-    <w:abstractNumId w:val="57"/>
+    <w:abstractNumId w:val="58"/>
   </w:num>
   <w:num w:numId="19" w16cid:durableId="836844129">
     <w:abstractNumId w:val="52"/>
@@ -11339,7 +12056,7 @@
     <w:abstractNumId w:val="39"/>
   </w:num>
   <w:num w:numId="44" w16cid:durableId="674069018">
-    <w:abstractNumId w:val="56"/>
+    <w:abstractNumId w:val="57"/>
   </w:num>
   <w:num w:numId="45" w16cid:durableId="281961448">
     <w:abstractNumId w:val="3"/>
@@ -11378,10 +12095,13 @@
     <w:abstractNumId w:val="20"/>
   </w:num>
   <w:num w:numId="57" w16cid:durableId="42296855">
-    <w:abstractNumId w:val="54"/>
+    <w:abstractNumId w:val="55"/>
   </w:num>
   <w:num w:numId="58" w16cid:durableId="300380798">
     <w:abstractNumId w:val="37"/>
+  </w:num>
+  <w:num w:numId="59" w16cid:durableId="1614824561">
+    <w:abstractNumId w:val="54"/>
   </w:num>
 </w:numbering>
 </file>
@@ -12399,7 +13119,7 @@
       <w14:ligatures w14:val="none"/>
     </w:rPr>
   </w:style>
-  <w:style w:type="character" w:styleId="Textoennegrita">
+  <w:style w:type="character" w:styleId="Fuerte">
     <w:name w:val="Strong"/>
     <w:basedOn w:val="Fuentedeprrafopredeter"/>
     <w:uiPriority w:val="22"/>
@@ -12504,6 +13224,50 @@
       <w:color w:val="605E5C"/>
       <w:shd w:val="clear" w:color="auto" w:fill="E1DFDD"/>
     </w:rPr>
+  </w:style>
+  <w:style w:type="paragraph" w:styleId="Encabezado">
+    <w:name w:val="header"/>
+    <w:basedOn w:val="Normal"/>
+    <w:link w:val="EncabezadoCar"/>
+    <w:uiPriority w:val="99"/>
+    <w:unhideWhenUsed/>
+    <w:rsid w:val="00652869"/>
+    <w:pPr>
+      <w:tabs>
+        <w:tab w:val="center" w:pos="4680"/>
+        <w:tab w:val="right" w:pos="9360"/>
+      </w:tabs>
+      <w:spacing w:after="0" w:line="240" w:lineRule="auto"/>
+    </w:pPr>
+  </w:style>
+  <w:style w:type="character" w:customStyle="1" w:styleId="EncabezadoCar">
+    <w:name w:val="Encabezado Car"/>
+    <w:basedOn w:val="Fuentedeprrafopredeter"/>
+    <w:link w:val="Encabezado"/>
+    <w:uiPriority w:val="99"/>
+    <w:rsid w:val="00652869"/>
+  </w:style>
+  <w:style w:type="paragraph" w:styleId="Piedepgina">
+    <w:name w:val="footer"/>
+    <w:basedOn w:val="Normal"/>
+    <w:link w:val="PiedepginaCar"/>
+    <w:uiPriority w:val="99"/>
+    <w:unhideWhenUsed/>
+    <w:rsid w:val="00652869"/>
+    <w:pPr>
+      <w:tabs>
+        <w:tab w:val="center" w:pos="4680"/>
+        <w:tab w:val="right" w:pos="9360"/>
+      </w:tabs>
+      <w:spacing w:after="0" w:line="240" w:lineRule="auto"/>
+    </w:pPr>
+  </w:style>
+  <w:style w:type="character" w:customStyle="1" w:styleId="PiedepginaCar">
+    <w:name w:val="Pie de página Car"/>
+    <w:basedOn w:val="Fuentedeprrafopredeter"/>
+    <w:link w:val="Piedepgina"/>
+    <w:uiPriority w:val="99"/>
+    <w:rsid w:val="00652869"/>
   </w:style>
 </w:styles>
 </file>
@@ -12801,4 +13565,192 @@
     </a:ext>
   </a:extLst>
 </a:theme>
+</file>
+
+<file path=customXml/item1.xml><?xml version="1.0" encoding="utf-8"?>
+<ct:contentTypeSchema xmlns:ct="http://schemas.microsoft.com/office/2006/metadata/contentType" xmlns:ma="http://schemas.microsoft.com/office/2006/metadata/properties/metaAttributes" ct:_="" ma:_="" ma:contentTypeName="Documento" ma:contentTypeID="0x0101005AACD96F6D2AE247B6DC964903F46AE7" ma:contentTypeVersion="3" ma:contentTypeDescription="Crear nuevo documento." ma:contentTypeScope="" ma:versionID="d7b449ae9ac64f8fbc8aeae11338ba79">
+  <xsd:schema xmlns:xsd="http://www.w3.org/2001/XMLSchema" xmlns:xs="http://www.w3.org/2001/XMLSchema" xmlns:p="http://schemas.microsoft.com/office/2006/metadata/properties" xmlns:ns2="141062d4-6ff8-4fa5-abdf-2f14c5141975" targetNamespace="http://schemas.microsoft.com/office/2006/metadata/properties" ma:root="true" ma:fieldsID="cd02a4864acd5ae5833079aa2f75f1b2" ns2:_="">
+    <xsd:import namespace="141062d4-6ff8-4fa5-abdf-2f14c5141975"/>
+    <xsd:element name="properties">
+      <xsd:complexType>
+        <xsd:sequence>
+          <xsd:element name="documentManagement">
+            <xsd:complexType>
+              <xsd:all>
+                <xsd:element ref="ns2:MediaServiceMetadata" minOccurs="0"/>
+                <xsd:element ref="ns2:MediaServiceFastMetadata" minOccurs="0"/>
+                <xsd:element ref="ns2:MediaServiceSearchProperties" minOccurs="0"/>
+              </xsd:all>
+            </xsd:complexType>
+          </xsd:element>
+        </xsd:sequence>
+      </xsd:complexType>
+    </xsd:element>
+  </xsd:schema>
+  <xsd:schema xmlns:xsd="http://www.w3.org/2001/XMLSchema" xmlns:xs="http://www.w3.org/2001/XMLSchema" xmlns:dms="http://schemas.microsoft.com/office/2006/documentManagement/types" xmlns:pc="http://schemas.microsoft.com/office/infopath/2007/PartnerControls" targetNamespace="141062d4-6ff8-4fa5-abdf-2f14c5141975" elementFormDefault="qualified">
+    <xsd:import namespace="http://schemas.microsoft.com/office/2006/documentManagement/types"/>
+    <xsd:import namespace="http://schemas.microsoft.com/office/infopath/2007/PartnerControls"/>
+    <xsd:element name="MediaServiceMetadata" ma:index="8" nillable="true" ma:displayName="MediaServiceMetadata" ma:hidden="true" ma:internalName="MediaServiceMetadata" ma:readOnly="true">
+      <xsd:simpleType>
+        <xsd:restriction base="dms:Note"/>
+      </xsd:simpleType>
+    </xsd:element>
+    <xsd:element name="MediaServiceFastMetadata" ma:index="9" nillable="true" ma:displayName="MediaServiceFastMetadata" ma:hidden="true" ma:internalName="MediaServiceFastMetadata" ma:readOnly="true">
+      <xsd:simpleType>
+        <xsd:restriction base="dms:Note"/>
+      </xsd:simpleType>
+    </xsd:element>
+    <xsd:element name="MediaServiceSearchProperties" ma:index="10" nillable="true" ma:displayName="MediaServiceSearchProperties" ma:hidden="true" ma:internalName="MediaServiceSearchProperties" ma:readOnly="true">
+      <xsd:simpleType>
+        <xsd:restriction base="dms:Note"/>
+      </xsd:simpleType>
+    </xsd:element>
+  </xsd:schema>
+  <xsd:schema xmlns="http://schemas.openxmlformats.org/package/2006/metadata/core-properties" xmlns:xsd="http://www.w3.org/2001/XMLSchema" xmlns:xsi="http://www.w3.org/2001/XMLSchema-instance" xmlns:dc="http://purl.org/dc/elements/1.1/" xmlns:dcterms="http://purl.org/dc/terms/" xmlns:odoc="http://schemas.microsoft.com/internal/obd" targetNamespace="http://schemas.openxmlformats.org/package/2006/metadata/core-properties" elementFormDefault="qualified" attributeFormDefault="unqualified" blockDefault="#all">
+    <xsd:import namespace="http://purl.org/dc/elements/1.1/" schemaLocation="http://dublincore.org/schemas/xmls/qdc/2003/04/02/dc.xsd"/>
+    <xsd:import namespace="http://purl.org/dc/terms/" schemaLocation="http://dublincore.org/schemas/xmls/qdc/2003/04/02/dcterms.xsd"/>
+    <xsd:element name="coreProperties" type="CT_coreProperties"/>
+    <xsd:complexType name="CT_coreProperties">
+      <xsd:all>
+        <xsd:element ref="dc:creator" minOccurs="0" maxOccurs="1"/>
+        <xsd:element ref="dcterms:created" minOccurs="0" maxOccurs="1"/>
+        <xsd:element ref="dc:identifier" minOccurs="0" maxOccurs="1"/>
+        <xsd:element name="contentType" minOccurs="0" maxOccurs="1" type="xsd:string" ma:index="0" ma:displayName="Tipo de contenido"/>
+        <xsd:element ref="dc:title" minOccurs="0" maxOccurs="1" ma:index="4" ma:displayName="Título"/>
+        <xsd:element ref="dc:subject" minOccurs="0" maxOccurs="1"/>
+        <xsd:element ref="dc:description" minOccurs="0" maxOccurs="1"/>
+        <xsd:element name="keywords" minOccurs="0" maxOccurs="1" type="xsd:string"/>
+        <xsd:element ref="dc:language" minOccurs="0" maxOccurs="1"/>
+        <xsd:element name="category" minOccurs="0" maxOccurs="1" type="xsd:string"/>
+        <xsd:element name="version" minOccurs="0" maxOccurs="1" type="xsd:string"/>
+        <xsd:element name="revision" minOccurs="0" maxOccurs="1" type="xsd:string">
+          <xsd:annotation>
+            <xsd:documentation>
+                        This value indicates the number of saves or revisions. The application is responsible for updating this value after each revision.
+                    </xsd:documentation>
+          </xsd:annotation>
+        </xsd:element>
+        <xsd:element name="lastModifiedBy" minOccurs="0" maxOccurs="1" type="xsd:string"/>
+        <xsd:element ref="dcterms:modified" minOccurs="0" maxOccurs="1"/>
+        <xsd:element name="contentStatus" minOccurs="0" maxOccurs="1" type="xsd:string"/>
+      </xsd:all>
+    </xsd:complexType>
+  </xsd:schema>
+  <xs:schema xmlns:pc="http://schemas.microsoft.com/office/infopath/2007/PartnerControls" xmlns:xs="http://www.w3.org/2001/XMLSchema" targetNamespace="http://schemas.microsoft.com/office/infopath/2007/PartnerControls" elementFormDefault="qualified" attributeFormDefault="unqualified">
+    <xs:element name="Person">
+      <xs:complexType>
+        <xs:sequence>
+          <xs:element ref="pc:DisplayName" minOccurs="0"/>
+          <xs:element ref="pc:AccountId" minOccurs="0"/>
+          <xs:element ref="pc:AccountType" minOccurs="0"/>
+        </xs:sequence>
+      </xs:complexType>
+    </xs:element>
+    <xs:element name="DisplayName" type="xs:string"/>
+    <xs:element name="AccountId" type="xs:string"/>
+    <xs:element name="AccountType" type="xs:string"/>
+    <xs:element name="BDCAssociatedEntity">
+      <xs:complexType>
+        <xs:sequence>
+          <xs:element ref="pc:BDCEntity" minOccurs="0" maxOccurs="unbounded"/>
+        </xs:sequence>
+        <xs:attribute ref="pc:EntityNamespace"/>
+        <xs:attribute ref="pc:EntityName"/>
+        <xs:attribute ref="pc:SystemInstanceName"/>
+        <xs:attribute ref="pc:AssociationName"/>
+      </xs:complexType>
+    </xs:element>
+    <xs:attribute name="EntityNamespace" type="xs:string"/>
+    <xs:attribute name="EntityName" type="xs:string"/>
+    <xs:attribute name="SystemInstanceName" type="xs:string"/>
+    <xs:attribute name="AssociationName" type="xs:string"/>
+    <xs:element name="BDCEntity">
+      <xs:complexType>
+        <xs:sequence>
+          <xs:element ref="pc:EntityDisplayName" minOccurs="0"/>
+          <xs:element ref="pc:EntityInstanceReference" minOccurs="0"/>
+          <xs:element ref="pc:EntityId1" minOccurs="0"/>
+          <xs:element ref="pc:EntityId2" minOccurs="0"/>
+          <xs:element ref="pc:EntityId3" minOccurs="0"/>
+          <xs:element ref="pc:EntityId4" minOccurs="0"/>
+          <xs:element ref="pc:EntityId5" minOccurs="0"/>
+        </xs:sequence>
+      </xs:complexType>
+    </xs:element>
+    <xs:element name="EntityDisplayName" type="xs:string"/>
+    <xs:element name="EntityInstanceReference" type="xs:string"/>
+    <xs:element name="EntityId1" type="xs:string"/>
+    <xs:element name="EntityId2" type="xs:string"/>
+    <xs:element name="EntityId3" type="xs:string"/>
+    <xs:element name="EntityId4" type="xs:string"/>
+    <xs:element name="EntityId5" type="xs:string"/>
+    <xs:element name="Terms">
+      <xs:complexType>
+        <xs:sequence>
+          <xs:element ref="pc:TermInfo" minOccurs="0" maxOccurs="unbounded"/>
+        </xs:sequence>
+      </xs:complexType>
+    </xs:element>
+    <xs:element name="TermInfo">
+      <xs:complexType>
+        <xs:sequence>
+          <xs:element ref="pc:TermName" minOccurs="0"/>
+          <xs:element ref="pc:TermId" minOccurs="0"/>
+        </xs:sequence>
+      </xs:complexType>
+    </xs:element>
+    <xs:element name="TermName" type="xs:string"/>
+    <xs:element name="TermId" type="xs:string"/>
+  </xs:schema>
+</ct:contentTypeSchema>
+</file>
+
+<file path=customXml/item2.xml><?xml version="1.0" encoding="utf-8"?>
+<?mso-contentType ?>
+<FormTemplates xmlns="http://schemas.microsoft.com/sharepoint/v3/contenttype/forms">
+  <Display>DocumentLibraryForm</Display>
+  <Edit>DocumentLibraryForm</Edit>
+  <New>DocumentLibraryForm</New>
+</FormTemplates>
+</file>
+
+<file path=customXml/item3.xml><?xml version="1.0" encoding="utf-8"?>
+<p:properties xmlns:p="http://schemas.microsoft.com/office/2006/metadata/properties" xmlns:xsi="http://www.w3.org/2001/XMLSchema-instance" xmlns:pc="http://schemas.microsoft.com/office/infopath/2007/PartnerControls">
+  <documentManagement/>
+</p:properties>
+</file>
+
+<file path=customXml/itemProps1.xml><?xml version="1.0" encoding="utf-8"?>
+<ds:datastoreItem xmlns:ds="http://schemas.openxmlformats.org/officeDocument/2006/customXml" ds:itemID="{78379B08-EE83-4FE0-B596-D7F622212EA7}">
+  <ds:schemaRefs>
+    <ds:schemaRef ds:uri="http://schemas.microsoft.com/office/2006/metadata/contentType"/>
+    <ds:schemaRef ds:uri="http://schemas.microsoft.com/office/2006/metadata/properties/metaAttributes"/>
+    <ds:schemaRef ds:uri="http://www.w3.org/2001/XMLSchema"/>
+    <ds:schemaRef ds:uri="http://schemas.microsoft.com/office/2006/metadata/properties"/>
+    <ds:schemaRef ds:uri="141062d4-6ff8-4fa5-abdf-2f14c5141975"/>
+    <ds:schemaRef ds:uri="http://schemas.microsoft.com/office/2006/documentManagement/types"/>
+    <ds:schemaRef ds:uri="http://schemas.microsoft.com/office/infopath/2007/PartnerControls"/>
+    <ds:schemaRef ds:uri="http://schemas.openxmlformats.org/package/2006/metadata/core-properties"/>
+    <ds:schemaRef ds:uri="http://purl.org/dc/elements/1.1/"/>
+    <ds:schemaRef ds:uri="http://purl.org/dc/terms/"/>
+    <ds:schemaRef ds:uri="http://schemas.microsoft.com/internal/obd"/>
+  </ds:schemaRefs>
+</ds:datastoreItem>
+</file>
+
+<file path=customXml/itemProps2.xml><?xml version="1.0" encoding="utf-8"?>
+<ds:datastoreItem xmlns:ds="http://schemas.openxmlformats.org/officeDocument/2006/customXml" ds:itemID="{8D4A70B9-DCE2-4FF2-B108-55EE9B2241D4}">
+  <ds:schemaRefs>
+    <ds:schemaRef ds:uri="http://schemas.microsoft.com/sharepoint/v3/contenttype/forms"/>
+  </ds:schemaRefs>
+</ds:datastoreItem>
+</file>
+
+<file path=customXml/itemProps3.xml><?xml version="1.0" encoding="utf-8"?>
+<ds:datastoreItem xmlns:ds="http://schemas.openxmlformats.org/officeDocument/2006/customXml" ds:itemID="{58E01D5C-95FF-45CA-B8DC-48A9F55110B7}">
+  <ds:schemaRefs>
+    <ds:schemaRef ds:uri="http://schemas.microsoft.com/office/2006/metadata/properties"/>
+    <ds:schemaRef ds:uri="http://schemas.microsoft.com/office/infopath/2007/PartnerControls"/>
+  </ds:schemaRefs>
+</ds:datastoreItem>
 </file>
</xml_diff>